<commit_message>
Extract clearUserData() from logout to reuse on user switch and CountAlbumsFeature returns -1 on exception to signal permission error
</commit_message>
<xml_diff>
--- a/Project1/B26 Ex01 LotemKimchi 318173481 ShaniSalomon 208573683/Design Patterns Assignment.docx
+++ b/Project1/B26 Ex01 LotemKimchi 318173481 ShaniSalomon 208573683/Design Patterns Assignment.docx
@@ -26,15 +26,18 @@
     <w:p>
       <w:pPr>
         <w:bidi/>
-      </w:pPr>
-      <w:r>
-        <w:rPr>
-          <w:rtl/>
-        </w:rPr>
-        <w:t>האפליקציה מממשת מספר פיצ'רים לניתוח מידע מחשבון</w:t>
-      </w:r>
-      <w:r>
-        <w:t xml:space="preserve"> Facebook </w:t>
+        <w:rPr>
+          <w:rtl/>
+        </w:rPr>
+      </w:pPr>
+      <w:r>
+        <w:rPr>
+          <w:rtl/>
+        </w:rPr>
+        <w:t>האפליקציה כוללת מספר פיצ'רים שמאפשרים להציג ולנתח מידע מחשבון ה</w:t>
+      </w:r>
+      <w:r>
+        <w:t xml:space="preserve">-Facebook </w:t>
       </w:r>
       <w:r>
         <w:rPr>
@@ -52,136 +55,122 @@
         <w:rPr>
           <w:rtl/>
         </w:rPr>
-        <w:t xml:space="preserve">כל פיצ'ר ממומש במחלקה נפרדת המיישמת את הממשק הגנרי </w:t>
+        <w:t>כל פיצ'ר ממומש כמחלקה נפרדת, כך שניתן להוסיף פיצ'רים חדשים בקלות בלי לשנות קוד קיים</w:t>
+      </w:r>
+      <w:r>
+        <w:t>.</w:t>
+      </w:r>
+    </w:p>
+    <w:p>
+      <w:pPr>
+        <w:bidi/>
+        <w:rPr>
+          <w:b/>
+          <w:bCs/>
+        </w:rPr>
+      </w:pPr>
+      <w:r>
+        <w:rPr>
+          <w:b/>
+          <w:bCs/>
+        </w:rPr>
+        <w:t>Feature 1 — Find Most Commented Photo</w:t>
+      </w:r>
+    </w:p>
+    <w:p>
+      <w:pPr>
+        <w:bidi/>
+      </w:pPr>
+      <w:r>
+        <w:rPr>
+          <w:rtl/>
+        </w:rPr>
+        <w:t>פיצ'ר זה מחפש את התמונה שקיבלה הכי הרבה תגובות מבין כל התמונות של המשתמש</w:t>
+      </w:r>
+      <w:r>
+        <w:t>.</w:t>
+      </w:r>
+    </w:p>
+    <w:p>
+      <w:pPr>
+        <w:bidi/>
+        <w:rPr>
+          <w:b/>
+          <w:bCs/>
+        </w:rPr>
+      </w:pPr>
+      <w:r>
+        <w:rPr>
+          <w:b/>
+          <w:bCs/>
+          <w:rtl/>
+        </w:rPr>
+        <w:t>אופן הפעולה</w:t>
+      </w:r>
+    </w:p>
+    <w:p>
+      <w:pPr>
+        <w:bidi/>
+      </w:pPr>
+      <w:r>
+        <w:rPr>
+          <w:rtl/>
+        </w:rPr>
+        <w:t>הפיצ'ר עובר על כל האלבומים של המשתמש</w:t>
+      </w:r>
+      <w:r>
+        <w:rPr>
+          <w:rFonts w:hint="cs"/>
+          <w:rtl/>
+        </w:rPr>
+        <w:t xml:space="preserve"> </w:t>
+      </w:r>
+      <w:r>
+        <w:rPr>
+          <w:rFonts w:hint="cs"/>
+          <w:rtl/>
+        </w:rPr>
+        <w:t>ו</w:t>
+      </w:r>
+      <w:r>
+        <w:rPr>
+          <w:rFonts w:hint="cs"/>
+          <w:rtl/>
+        </w:rPr>
+        <w:t>בתוך כל אלבום</w:t>
+      </w:r>
+      <w:r>
+        <w:rPr>
+          <w:rtl/>
+        </w:rPr>
+        <w:t xml:space="preserve"> עובר על כל התמונות</w:t>
+      </w:r>
+    </w:p>
+    <w:p>
+      <w:pPr>
+        <w:bidi/>
+      </w:pPr>
+      <w:r>
+        <w:rPr>
+          <w:rtl/>
+        </w:rPr>
+        <w:t>לכל תמונה נבדק מספר התגובות</w:t>
+      </w:r>
+      <w:r>
+        <w:t>:</w:t>
+      </w:r>
+      <w:r>
+        <w:rPr>
+          <w:rFonts w:hint="cs"/>
+          <w:rtl/>
+        </w:rPr>
+        <w:t xml:space="preserve"> </w:t>
       </w:r>
       <w:proofErr w:type="spellStart"/>
       <w:r>
-        <w:t>IFacebookFeature</w:t>
+        <w:t>photo.Comments.Count</w:t>
       </w:r>
       <w:proofErr w:type="spellEnd"/>
-      <w:r>
-        <w:t>&lt;T&gt;.</w:t>
-      </w:r>
-    </w:p>
-    <w:p>
-      <w:pPr>
-        <w:bidi/>
-      </w:pPr>
-    </w:p>
-    <w:p>
-      <w:pPr>
-        <w:bidi/>
-        <w:rPr>
-          <w:b/>
-          <w:bCs/>
-        </w:rPr>
-      </w:pPr>
-      <w:r>
-        <w:rPr>
-          <w:b/>
-          <w:bCs/>
-        </w:rPr>
-        <w:t>Feature 1 — Find Most Commented Photo</w:t>
-      </w:r>
-    </w:p>
-    <w:p>
-      <w:pPr>
-        <w:bidi/>
-      </w:pPr>
-      <w:r>
-        <w:rPr>
-          <w:rtl/>
-        </w:rPr>
-        <w:t>פיצ'ר זה מאתר את התמונה בעלת מספר התגובות הגבוה ביותר מבין כל התמונות בכל האלבומים של המשתמש המחובר</w:t>
-      </w:r>
-      <w:r>
-        <w:t>.</w:t>
-      </w:r>
-    </w:p>
-    <w:p>
-      <w:pPr>
-        <w:bidi/>
-        <w:rPr>
-          <w:b/>
-          <w:bCs/>
-        </w:rPr>
-      </w:pPr>
-      <w:r>
-        <w:rPr>
-          <w:b/>
-          <w:bCs/>
-          <w:rtl/>
-        </w:rPr>
-        <w:t>אופן הפעולה</w:t>
-      </w:r>
-    </w:p>
-    <w:p>
-      <w:pPr>
-        <w:bidi/>
-      </w:pPr>
-      <w:r>
-        <w:rPr>
-          <w:rtl/>
-        </w:rPr>
-        <w:t>הפיצ'ר עובר על כל האלבומים של המשתמש</w:t>
-      </w:r>
-      <w:r>
-        <w:t xml:space="preserve"> (</w:t>
-      </w:r>
-      <w:proofErr w:type="spellStart"/>
-      <w:r>
-        <w:t>user.Albums</w:t>
-      </w:r>
-      <w:proofErr w:type="spellEnd"/>
-      <w:r>
-        <w:t>).</w:t>
-      </w:r>
-      <w:r>
-        <w:br/>
-      </w:r>
-      <w:r>
-        <w:rPr>
-          <w:rtl/>
-        </w:rPr>
-        <w:t>עבור כל אלבום הוא עובר על כל התמונות</w:t>
-      </w:r>
-      <w:r>
-        <w:t xml:space="preserve"> (</w:t>
-      </w:r>
-      <w:proofErr w:type="spellStart"/>
-      <w:r>
-        <w:t>album.Photos</w:t>
-      </w:r>
-      <w:proofErr w:type="spellEnd"/>
-      <w:r>
-        <w:t>).</w:t>
-      </w:r>
-    </w:p>
-    <w:p>
-      <w:pPr>
-        <w:bidi/>
-      </w:pPr>
-      <w:r>
-        <w:rPr>
-          <w:rtl/>
-        </w:rPr>
-        <w:t>לכל תמונה נבדק מספר התגובות</w:t>
-      </w:r>
-      <w:r>
-        <w:t>:</w:t>
-      </w:r>
-    </w:p>
-    <w:p>
-      <w:pPr>
-        <w:bidi/>
-      </w:pPr>
-      <w:proofErr w:type="spellStart"/>
-      <w:proofErr w:type="gramStart"/>
-      <w:r>
-        <w:t>photo.Comments.Count</w:t>
-      </w:r>
-      <w:proofErr w:type="spellEnd"/>
-      <w:proofErr w:type="gramEnd"/>
     </w:p>
     <w:p>
       <w:pPr>
@@ -226,27 +215,7 @@
         <w:rPr>
           <w:rtl/>
         </w:rPr>
-        <w:t>אם נמצאה תמונה – מוצגת התמונה ב</w:t>
-      </w:r>
-      <w:r>
-        <w:t>-</w:t>
-      </w:r>
-      <w:proofErr w:type="spellStart"/>
-      <w:r>
-        <w:t>PictureBox</w:t>
-      </w:r>
-      <w:proofErr w:type="spellEnd"/>
-      <w:r>
-        <w:t xml:space="preserve"> </w:t>
-      </w:r>
-      <w:r>
-        <w:rPr>
-          <w:rtl/>
-        </w:rPr>
-        <w:t>ומתחתיה מספר התגובות</w:t>
-      </w:r>
-      <w:r>
-        <w:t>.</w:t>
+        <w:t>אם נמצאה תמונה — היא מוצגת במסך, ומתחתיה מוצג מספר התגובות</w:t>
       </w:r>
     </w:p>
     <w:p>
@@ -297,23 +266,25 @@
     <w:tbl>
       <w:tblPr>
         <w:tblStyle w:val="TableGrid"/>
-        <w:tblW w:w="0" w:type="auto"/>
+        <w:tblW w:w="9355" w:type="dxa"/>
         <w:tblLook w:val="04A0" w:firstRow="1" w:lastRow="0" w:firstColumn="1" w:lastColumn="0" w:noHBand="0" w:noVBand="1"/>
       </w:tblPr>
       <w:tblGrid>
-        <w:gridCol w:w="5904"/>
-        <w:gridCol w:w="3074"/>
+        <w:gridCol w:w="6025"/>
+        <w:gridCol w:w="3330"/>
       </w:tblGrid>
       <w:tr>
         <w:tc>
           <w:tcPr>
-            <w:tcW w:w="0" w:type="auto"/>
+            <w:tcW w:w="6025" w:type="dxa"/>
+            <w:vAlign w:val="center"/>
             <w:hideMark/>
           </w:tcPr>
           <w:p>
             <w:pPr>
               <w:bidi/>
               <w:spacing w:after="160" w:line="278" w:lineRule="auto"/>
+              <w:jc w:val="center"/>
               <w:rPr>
                 <w:b/>
                 <w:bCs/>
@@ -331,13 +302,15 @@
         </w:tc>
         <w:tc>
           <w:tcPr>
-            <w:tcW w:w="0" w:type="auto"/>
+            <w:tcW w:w="3330" w:type="dxa"/>
+            <w:vAlign w:val="center"/>
             <w:hideMark/>
           </w:tcPr>
           <w:p>
             <w:pPr>
               <w:bidi/>
               <w:spacing w:after="160" w:line="278" w:lineRule="auto"/>
+              <w:jc w:val="center"/>
               <w:rPr>
                 <w:b/>
                 <w:bCs/>
@@ -357,13 +330,15 @@
       <w:tr>
         <w:tc>
           <w:tcPr>
-            <w:tcW w:w="0" w:type="auto"/>
+            <w:tcW w:w="6025" w:type="dxa"/>
+            <w:vAlign w:val="center"/>
             <w:hideMark/>
           </w:tcPr>
           <w:p>
             <w:pPr>
               <w:bidi/>
               <w:spacing w:after="160" w:line="278" w:lineRule="auto"/>
+              <w:jc w:val="right"/>
             </w:pPr>
             <w:proofErr w:type="spellStart"/>
             <w:r>
@@ -374,7 +349,7 @@
         </w:tc>
         <w:tc>
           <w:tcPr>
-            <w:tcW w:w="0" w:type="auto"/>
+            <w:tcW w:w="3330" w:type="dxa"/>
             <w:hideMark/>
           </w:tcPr>
           <w:p>
@@ -394,13 +369,15 @@
       <w:tr>
         <w:tc>
           <w:tcPr>
-            <w:tcW w:w="0" w:type="auto"/>
+            <w:tcW w:w="6025" w:type="dxa"/>
+            <w:vAlign w:val="center"/>
             <w:hideMark/>
           </w:tcPr>
           <w:p>
             <w:pPr>
               <w:bidi/>
               <w:spacing w:after="160" w:line="278" w:lineRule="auto"/>
+              <w:jc w:val="right"/>
             </w:pPr>
             <w:proofErr w:type="spellStart"/>
             <w:r>
@@ -414,7 +391,7 @@
         </w:tc>
         <w:tc>
           <w:tcPr>
-            <w:tcW w:w="0" w:type="auto"/>
+            <w:tcW w:w="3330" w:type="dxa"/>
             <w:hideMark/>
           </w:tcPr>
           <w:p>
@@ -431,291 +408,245 @@
           </w:p>
         </w:tc>
       </w:tr>
+    </w:tbl>
+    <w:p>
+      <w:pPr>
+        <w:bidi/>
+      </w:pPr>
+    </w:p>
+    <w:p>
+      <w:pPr>
+        <w:bidi/>
+        <w:rPr>
+          <w:b/>
+          <w:bCs/>
+        </w:rPr>
+      </w:pPr>
+      <w:r>
+        <w:rPr>
+          <w:b/>
+          <w:bCs/>
+        </w:rPr>
+        <w:t>Feature 2 — Most Liked Photo</w:t>
+      </w:r>
+    </w:p>
+    <w:p>
+      <w:pPr>
+        <w:bidi/>
+      </w:pPr>
+      <w:r>
+        <w:rPr>
+          <w:rtl/>
+        </w:rPr>
+        <w:t xml:space="preserve">פיצ'ר זה מאתר את התמונה בעלת מספר </w:t>
+      </w:r>
+      <w:proofErr w:type="spellStart"/>
+      <w:r>
+        <w:rPr>
+          <w:rtl/>
+        </w:rPr>
+        <w:t>הלייקים</w:t>
+      </w:r>
+      <w:proofErr w:type="spellEnd"/>
+      <w:r>
+        <w:rPr>
+          <w:rtl/>
+        </w:rPr>
+        <w:t xml:space="preserve"> הגבוה ביותר</w:t>
+      </w:r>
+      <w:r>
+        <w:t>.</w:t>
+      </w:r>
+    </w:p>
+    <w:p>
+      <w:pPr>
+        <w:bidi/>
+        <w:rPr>
+          <w:b/>
+          <w:bCs/>
+        </w:rPr>
+      </w:pPr>
+      <w:r>
+        <w:rPr>
+          <w:b/>
+          <w:bCs/>
+          <w:rtl/>
+        </w:rPr>
+        <w:t>אופן הפעולה</w:t>
+      </w:r>
+    </w:p>
+    <w:p>
+      <w:pPr>
+        <w:bidi/>
+      </w:pPr>
+      <w:r>
+        <w:rPr>
+          <w:rtl/>
+        </w:rPr>
+        <w:t xml:space="preserve">הפיצ'ר עובר על כל האלבומים והתמונות ובודק עבור כל תמונה את מספר </w:t>
+      </w:r>
+      <w:proofErr w:type="spellStart"/>
+      <w:r>
+        <w:rPr>
+          <w:rtl/>
+        </w:rPr>
+        <w:t>הלייקים</w:t>
+      </w:r>
+      <w:proofErr w:type="spellEnd"/>
+      <w:r>
+        <w:t>:</w:t>
+      </w:r>
+      <w:r>
+        <w:rPr>
+          <w:rFonts w:hint="cs"/>
+          <w:rtl/>
+        </w:rPr>
+        <w:t xml:space="preserve"> </w:t>
+      </w:r>
+      <w:proofErr w:type="spellStart"/>
+      <w:r>
+        <w:t>photo.LikedBy.Count</w:t>
+      </w:r>
+      <w:proofErr w:type="spellEnd"/>
+    </w:p>
+    <w:p>
+      <w:pPr>
+        <w:bidi/>
+      </w:pPr>
+      <w:r>
+        <w:rPr>
+          <w:rtl/>
+        </w:rPr>
+        <w:t xml:space="preserve">התמונה עם מספר </w:t>
+      </w:r>
+      <w:proofErr w:type="spellStart"/>
+      <w:r>
+        <w:rPr>
+          <w:rtl/>
+        </w:rPr>
+        <w:t>הלייקים</w:t>
+      </w:r>
+      <w:proofErr w:type="spellEnd"/>
+      <w:r>
+        <w:rPr>
+          <w:rtl/>
+        </w:rPr>
+        <w:t xml:space="preserve"> הגבוה ביותר נשמרת ומוחזרת</w:t>
+      </w:r>
+      <w:r>
+        <w:t>.</w:t>
+      </w:r>
+    </w:p>
+    <w:p>
+      <w:pPr>
+        <w:bidi/>
+        <w:rPr>
+          <w:b/>
+          <w:bCs/>
+        </w:rPr>
+      </w:pPr>
+      <w:r>
+        <w:rPr>
+          <w:b/>
+          <w:bCs/>
+          <w:rtl/>
+        </w:rPr>
+        <w:t>פלט</w:t>
+      </w:r>
+    </w:p>
+    <w:p>
+      <w:pPr>
+        <w:numPr>
+          <w:ilvl w:val="0"/>
+          <w:numId w:val="5"/>
+        </w:numPr>
+        <w:bidi/>
+      </w:pPr>
+      <w:r>
+        <w:rPr>
+          <w:rtl/>
+        </w:rPr>
+        <w:t>אם נמצאה תמונה – היא מוצגת במסך</w:t>
+      </w:r>
+      <w:r>
+        <w:t>.</w:t>
+      </w:r>
+      <w:r>
+        <w:rPr>
+          <w:rFonts w:hint="cs"/>
+          <w:rtl/>
+        </w:rPr>
+        <w:t xml:space="preserve"> </w:t>
+      </w:r>
+    </w:p>
+    <w:p>
+      <w:pPr>
+        <w:numPr>
+          <w:ilvl w:val="0"/>
+          <w:numId w:val="5"/>
+        </w:numPr>
+        <w:bidi/>
+      </w:pPr>
+      <w:r>
+        <w:rPr>
+          <w:rtl/>
+        </w:rPr>
+        <w:t>אם לא נמצאה – מוצגת הודעה</w:t>
+      </w:r>
+      <w:r>
+        <w:t>:</w:t>
+      </w:r>
+      <w:r>
+        <w:rPr>
+          <w:rFonts w:hint="cs"/>
+          <w:rtl/>
+        </w:rPr>
+        <w:t xml:space="preserve"> </w:t>
+      </w:r>
+      <w:r>
+        <w:t>No photo found</w:t>
+      </w:r>
+    </w:p>
+    <w:p>
+      <w:pPr>
+        <w:bidi/>
+        <w:rPr>
+          <w:b/>
+          <w:bCs/>
+        </w:rPr>
+      </w:pPr>
+      <w:r>
+        <w:rPr>
+          <w:b/>
+          <w:bCs/>
+          <w:rtl/>
+        </w:rPr>
+        <w:lastRenderedPageBreak/>
+        <w:t>מיקום בקוד</w:t>
+      </w:r>
+    </w:p>
+    <w:tbl>
+      <w:tblPr>
+        <w:tblStyle w:val="TableGrid"/>
+        <w:tblW w:w="9355" w:type="dxa"/>
+        <w:tblLook w:val="04A0" w:firstRow="1" w:lastRow="0" w:firstColumn="1" w:lastColumn="0" w:noHBand="0" w:noVBand="1"/>
+      </w:tblPr>
+      <w:tblGrid>
+        <w:gridCol w:w="6115"/>
+        <w:gridCol w:w="3240"/>
+      </w:tblGrid>
       <w:tr>
         <w:tc>
           <w:tcPr>
-            <w:tcW w:w="0" w:type="auto"/>
+            <w:tcW w:w="6115" w:type="dxa"/>
+            <w:vAlign w:val="center"/>
             <w:hideMark/>
           </w:tcPr>
           <w:p>
             <w:pPr>
               <w:bidi/>
               <w:spacing w:after="160" w:line="278" w:lineRule="auto"/>
-            </w:pPr>
-            <w:proofErr w:type="spellStart"/>
-            <w:r>
-              <w:t>FormMain.Designer.cs</w:t>
-            </w:r>
-            <w:proofErr w:type="spellEnd"/>
-          </w:p>
-        </w:tc>
-        <w:tc>
-          <w:tcPr>
-            <w:tcW w:w="0" w:type="auto"/>
-            <w:hideMark/>
-          </w:tcPr>
-          <w:p>
-            <w:pPr>
-              <w:bidi/>
-              <w:spacing w:after="160" w:line="278" w:lineRule="auto"/>
-            </w:pPr>
-            <w:r>
-              <w:rPr>
-                <w:rtl/>
-              </w:rPr>
-              <w:t>רכיבי</w:t>
-            </w:r>
-            <w:r>
-              <w:t xml:space="preserve"> UI (</w:t>
-            </w:r>
-            <w:proofErr w:type="spellStart"/>
-            <w:r>
-              <w:t>PictureBox</w:t>
-            </w:r>
-            <w:proofErr w:type="spellEnd"/>
-            <w:r>
-              <w:t xml:space="preserve"> + Label)</w:t>
-            </w:r>
-          </w:p>
-        </w:tc>
-      </w:tr>
-    </w:tbl>
-    <w:p>
-      <w:pPr>
-        <w:bidi/>
-      </w:pPr>
-    </w:p>
-    <w:p>
-      <w:pPr>
-        <w:bidi/>
-        <w:rPr>
-          <w:b/>
-          <w:bCs/>
-        </w:rPr>
-      </w:pPr>
-      <w:r>
-        <w:rPr>
-          <w:b/>
-          <w:bCs/>
-        </w:rPr>
-        <w:t>Feature 2 — Most Liked Photo</w:t>
-      </w:r>
-    </w:p>
-    <w:p>
-      <w:pPr>
-        <w:bidi/>
-      </w:pPr>
-      <w:r>
-        <w:rPr>
-          <w:rtl/>
-        </w:rPr>
-        <w:t xml:space="preserve">פיצ'ר זה מאתר את התמונה בעלת מספר </w:t>
-      </w:r>
-      <w:proofErr w:type="spellStart"/>
-      <w:r>
-        <w:rPr>
-          <w:rtl/>
-        </w:rPr>
-        <w:t>הלייקים</w:t>
-      </w:r>
-      <w:proofErr w:type="spellEnd"/>
-      <w:r>
-        <w:rPr>
-          <w:rtl/>
-        </w:rPr>
-        <w:t xml:space="preserve"> הגבוה ביותר</w:t>
-      </w:r>
-      <w:r>
-        <w:t>.</w:t>
-      </w:r>
-    </w:p>
-    <w:p>
-      <w:pPr>
-        <w:bidi/>
-        <w:rPr>
-          <w:b/>
-          <w:bCs/>
-        </w:rPr>
-      </w:pPr>
-      <w:r>
-        <w:rPr>
-          <w:b/>
-          <w:bCs/>
-          <w:rtl/>
-        </w:rPr>
-        <w:t>אופן הפעולה</w:t>
-      </w:r>
-    </w:p>
-    <w:p>
-      <w:pPr>
-        <w:bidi/>
-      </w:pPr>
-      <w:r>
-        <w:rPr>
-          <w:rtl/>
-        </w:rPr>
-        <w:t xml:space="preserve">הפיצ'ר עובר על כל האלבומים והתמונות ובודק עבור כל תמונה את מספר </w:t>
-      </w:r>
-      <w:proofErr w:type="spellStart"/>
-      <w:r>
-        <w:rPr>
-          <w:rtl/>
-        </w:rPr>
-        <w:t>הלייקים</w:t>
-      </w:r>
-      <w:proofErr w:type="spellEnd"/>
-      <w:r>
-        <w:t>:</w:t>
-      </w:r>
-    </w:p>
-    <w:p>
-      <w:pPr>
-        <w:bidi/>
-      </w:pPr>
-      <w:proofErr w:type="spellStart"/>
-      <w:proofErr w:type="gramStart"/>
-      <w:r>
-        <w:t>photo.LikedBy.Count</w:t>
-      </w:r>
-      <w:proofErr w:type="spellEnd"/>
-      <w:proofErr w:type="gramEnd"/>
-    </w:p>
-    <w:p>
-      <w:pPr>
-        <w:bidi/>
-      </w:pPr>
-      <w:r>
-        <w:rPr>
-          <w:rtl/>
-        </w:rPr>
-        <w:lastRenderedPageBreak/>
-        <w:t xml:space="preserve">התמונה עם מספר </w:t>
-      </w:r>
-      <w:proofErr w:type="spellStart"/>
-      <w:r>
-        <w:rPr>
-          <w:rtl/>
-        </w:rPr>
-        <w:t>הלייקים</w:t>
-      </w:r>
-      <w:proofErr w:type="spellEnd"/>
-      <w:r>
-        <w:rPr>
-          <w:rtl/>
-        </w:rPr>
-        <w:t xml:space="preserve"> הגבוה ביותר נשמרת ומוחזרת</w:t>
-      </w:r>
-      <w:r>
-        <w:t>.</w:t>
-      </w:r>
-    </w:p>
-    <w:p>
-      <w:pPr>
-        <w:bidi/>
-        <w:rPr>
-          <w:b/>
-          <w:bCs/>
-        </w:rPr>
-      </w:pPr>
-      <w:r>
-        <w:rPr>
-          <w:b/>
-          <w:bCs/>
-          <w:rtl/>
-        </w:rPr>
-        <w:t>פלט</w:t>
-      </w:r>
-    </w:p>
-    <w:p>
-      <w:pPr>
-        <w:numPr>
-          <w:ilvl w:val="0"/>
-          <w:numId w:val="5"/>
-        </w:numPr>
-        <w:bidi/>
-      </w:pPr>
-      <w:r>
-        <w:rPr>
-          <w:rtl/>
-        </w:rPr>
-        <w:t>אם נמצאה תמונה – היא מוצגת במסך</w:t>
-      </w:r>
-      <w:r>
-        <w:t>.</w:t>
-      </w:r>
-      <w:r>
-        <w:rPr>
-          <w:rFonts w:hint="cs"/>
-          <w:rtl/>
-        </w:rPr>
-        <w:t xml:space="preserve"> </w:t>
-      </w:r>
-    </w:p>
-    <w:p>
-      <w:pPr>
-        <w:numPr>
-          <w:ilvl w:val="0"/>
-          <w:numId w:val="5"/>
-        </w:numPr>
-        <w:bidi/>
-      </w:pPr>
-      <w:r>
-        <w:rPr>
-          <w:rtl/>
-        </w:rPr>
-        <w:t>אם לא נמצאה – מוצגת הודעה</w:t>
-      </w:r>
-      <w:r>
-        <w:t>:</w:t>
-      </w:r>
-      <w:r>
-        <w:rPr>
-          <w:rFonts w:hint="cs"/>
-          <w:rtl/>
-        </w:rPr>
-        <w:t xml:space="preserve"> </w:t>
-      </w:r>
-      <w:r>
-        <w:t>No photo found</w:t>
-      </w:r>
-    </w:p>
-    <w:p>
-      <w:pPr>
-        <w:bidi/>
-        <w:rPr>
-          <w:b/>
-          <w:bCs/>
-        </w:rPr>
-      </w:pPr>
-      <w:r>
-        <w:rPr>
-          <w:b/>
-          <w:bCs/>
-          <w:rtl/>
-        </w:rPr>
-        <w:t>מיקום בקוד</w:t>
-      </w:r>
-    </w:p>
-    <w:tbl>
-      <w:tblPr>
-        <w:tblStyle w:val="TableGrid"/>
-        <w:tblW w:w="0" w:type="auto"/>
-        <w:tblLook w:val="04A0" w:firstRow="1" w:lastRow="0" w:firstColumn="1" w:lastColumn="0" w:noHBand="0" w:noVBand="1"/>
-      </w:tblPr>
-      <w:tblGrid>
-        <w:gridCol w:w="5149"/>
-        <w:gridCol w:w="3023"/>
-      </w:tblGrid>
-      <w:tr>
-        <w:tc>
-          <w:tcPr>
-            <w:tcW w:w="0" w:type="auto"/>
-            <w:hideMark/>
-          </w:tcPr>
-          <w:p>
-            <w:pPr>
-              <w:bidi/>
-              <w:spacing w:after="160" w:line="278" w:lineRule="auto"/>
+              <w:jc w:val="center"/>
               <w:rPr>
                 <w:b/>
                 <w:bCs/>
@@ -733,13 +664,15 @@
         </w:tc>
         <w:tc>
           <w:tcPr>
-            <w:tcW w:w="0" w:type="auto"/>
+            <w:tcW w:w="3240" w:type="dxa"/>
+            <w:vAlign w:val="center"/>
             <w:hideMark/>
           </w:tcPr>
           <w:p>
             <w:pPr>
               <w:bidi/>
               <w:spacing w:after="160" w:line="278" w:lineRule="auto"/>
+              <w:jc w:val="center"/>
               <w:rPr>
                 <w:b/>
                 <w:bCs/>
@@ -759,13 +692,15 @@
       <w:tr>
         <w:tc>
           <w:tcPr>
-            <w:tcW w:w="0" w:type="auto"/>
+            <w:tcW w:w="6115" w:type="dxa"/>
+            <w:vAlign w:val="center"/>
             <w:hideMark/>
           </w:tcPr>
           <w:p>
             <w:pPr>
               <w:bidi/>
               <w:spacing w:after="160" w:line="278" w:lineRule="auto"/>
+              <w:jc w:val="right"/>
             </w:pPr>
             <w:proofErr w:type="spellStart"/>
             <w:r>
@@ -776,7 +711,7 @@
         </w:tc>
         <w:tc>
           <w:tcPr>
-            <w:tcW w:w="0" w:type="auto"/>
+            <w:tcW w:w="3240" w:type="dxa"/>
             <w:hideMark/>
           </w:tcPr>
           <w:p>
@@ -796,13 +731,15 @@
       <w:tr>
         <w:tc>
           <w:tcPr>
-            <w:tcW w:w="0" w:type="auto"/>
+            <w:tcW w:w="6115" w:type="dxa"/>
+            <w:vAlign w:val="center"/>
             <w:hideMark/>
           </w:tcPr>
           <w:p>
             <w:pPr>
               <w:bidi/>
               <w:spacing w:after="160" w:line="278" w:lineRule="auto"/>
+              <w:jc w:val="right"/>
             </w:pPr>
             <w:proofErr w:type="spellStart"/>
             <w:r>
@@ -816,7 +753,7 @@
         </w:tc>
         <w:tc>
           <w:tcPr>
-            <w:tcW w:w="0" w:type="auto"/>
+            <w:tcW w:w="3240" w:type="dxa"/>
             <w:hideMark/>
           </w:tcPr>
           <w:p>
@@ -1015,23 +952,25 @@
     <w:tbl>
       <w:tblPr>
         <w:tblStyle w:val="TableGrid"/>
-        <w:tblW w:w="0" w:type="auto"/>
+        <w:tblW w:w="9355" w:type="dxa"/>
         <w:tblLook w:val="04A0" w:firstRow="1" w:lastRow="0" w:firstColumn="1" w:lastColumn="0" w:noHBand="0" w:noVBand="1"/>
       </w:tblPr>
       <w:tblGrid>
-        <w:gridCol w:w="4777"/>
-        <w:gridCol w:w="2943"/>
+        <w:gridCol w:w="6115"/>
+        <w:gridCol w:w="3240"/>
       </w:tblGrid>
       <w:tr>
         <w:tc>
           <w:tcPr>
-            <w:tcW w:w="0" w:type="auto"/>
+            <w:tcW w:w="6115" w:type="dxa"/>
+            <w:vAlign w:val="center"/>
             <w:hideMark/>
           </w:tcPr>
           <w:p>
             <w:pPr>
               <w:bidi/>
               <w:spacing w:after="160" w:line="278" w:lineRule="auto"/>
+              <w:jc w:val="center"/>
               <w:rPr>
                 <w:b/>
                 <w:bCs/>
@@ -1049,13 +988,15 @@
         </w:tc>
         <w:tc>
           <w:tcPr>
-            <w:tcW w:w="0" w:type="auto"/>
+            <w:tcW w:w="3240" w:type="dxa"/>
+            <w:vAlign w:val="center"/>
             <w:hideMark/>
           </w:tcPr>
           <w:p>
             <w:pPr>
               <w:bidi/>
               <w:spacing w:after="160" w:line="278" w:lineRule="auto"/>
+              <w:jc w:val="center"/>
               <w:rPr>
                 <w:b/>
                 <w:bCs/>
@@ -1075,13 +1016,15 @@
       <w:tr>
         <w:tc>
           <w:tcPr>
-            <w:tcW w:w="0" w:type="auto"/>
+            <w:tcW w:w="6115" w:type="dxa"/>
+            <w:vAlign w:val="center"/>
             <w:hideMark/>
           </w:tcPr>
           <w:p>
             <w:pPr>
               <w:bidi/>
               <w:spacing w:after="160" w:line="278" w:lineRule="auto"/>
+              <w:jc w:val="right"/>
             </w:pPr>
             <w:proofErr w:type="spellStart"/>
             <w:r>
@@ -1092,7 +1035,7 @@
         </w:tc>
         <w:tc>
           <w:tcPr>
-            <w:tcW w:w="0" w:type="auto"/>
+            <w:tcW w:w="3240" w:type="dxa"/>
             <w:hideMark/>
           </w:tcPr>
           <w:p>
@@ -1112,13 +1055,15 @@
       <w:tr>
         <w:tc>
           <w:tcPr>
-            <w:tcW w:w="0" w:type="auto"/>
+            <w:tcW w:w="6115" w:type="dxa"/>
+            <w:vAlign w:val="center"/>
             <w:hideMark/>
           </w:tcPr>
           <w:p>
             <w:pPr>
               <w:bidi/>
               <w:spacing w:after="160" w:line="278" w:lineRule="auto"/>
+              <w:jc w:val="right"/>
             </w:pPr>
             <w:proofErr w:type="spellStart"/>
             <w:r>
@@ -1132,7 +1077,7 @@
         </w:tc>
         <w:tc>
           <w:tcPr>
-            <w:tcW w:w="0" w:type="auto"/>
+            <w:tcW w:w="3240" w:type="dxa"/>
             <w:hideMark/>
           </w:tcPr>
           <w:p>
@@ -1179,84 +1124,88 @@
         <w:rPr>
           <w:rtl/>
         </w:rPr>
+        <w:t>פיצ'ר זה מחפש את האלבום שמכיל הכי הרבה תמונות</w:t>
+      </w:r>
+      <w:r>
+        <w:rPr>
+          <w:rFonts w:hint="cs"/>
+          <w:rtl/>
+        </w:rPr>
+        <w:t>.</w:t>
+      </w:r>
+    </w:p>
+    <w:p>
+      <w:pPr>
+        <w:bidi/>
+        <w:rPr>
+          <w:b/>
+          <w:bCs/>
+        </w:rPr>
+      </w:pPr>
+      <w:r>
+        <w:rPr>
+          <w:b/>
+          <w:bCs/>
+          <w:rtl/>
+        </w:rPr>
+        <w:t>אופן הפעולה</w:t>
+      </w:r>
+    </w:p>
+    <w:p>
+      <w:pPr>
+        <w:bidi/>
+      </w:pPr>
+      <w:r>
+        <w:rPr>
+          <w:rtl/>
+        </w:rPr>
+        <w:t>הפיצ'ר עובר על כל האלבומים של המשתמש ומשווה</w:t>
+      </w:r>
+      <w:r>
+        <w:t>:</w:t>
+      </w:r>
+      <w:r>
+        <w:rPr>
+          <w:rFonts w:hint="cs"/>
+          <w:rtl/>
+        </w:rPr>
+        <w:t xml:space="preserve"> </w:t>
+      </w:r>
+      <w:proofErr w:type="spellStart"/>
+      <w:r>
+        <w:t>album.Photos.Count</w:t>
+      </w:r>
+      <w:proofErr w:type="spellEnd"/>
+    </w:p>
+    <w:p>
+      <w:pPr>
+        <w:bidi/>
+      </w:pPr>
+      <w:r>
+        <w:rPr>
+          <w:rtl/>
+        </w:rPr>
+        <w:t>האלבום עם המספר הגבוה ביותר נשמר ומוחזר</w:t>
+      </w:r>
+      <w:r>
+        <w:t>.</w:t>
+      </w:r>
+    </w:p>
+    <w:p>
+      <w:pPr>
+        <w:bidi/>
+        <w:rPr>
+          <w:b/>
+          <w:bCs/>
+        </w:rPr>
+      </w:pPr>
+      <w:r>
+        <w:rPr>
+          <w:b/>
+          <w:bCs/>
+          <w:rtl/>
+        </w:rPr>
         <w:lastRenderedPageBreak/>
-        <w:t>פיצ'ר זה מאתר את האלבום המכיל את מספר התמונות הגבוה ביותר</w:t>
-      </w:r>
-      <w:r>
-        <w:t>.</w:t>
-      </w:r>
-    </w:p>
-    <w:p>
-      <w:pPr>
-        <w:bidi/>
-        <w:rPr>
-          <w:b/>
-          <w:bCs/>
-        </w:rPr>
-      </w:pPr>
-      <w:r>
-        <w:rPr>
-          <w:b/>
-          <w:bCs/>
-          <w:rtl/>
-        </w:rPr>
-        <w:t>אופן הפעולה</w:t>
-      </w:r>
-    </w:p>
-    <w:p>
-      <w:pPr>
-        <w:bidi/>
-      </w:pPr>
-      <w:r>
-        <w:rPr>
-          <w:rtl/>
-        </w:rPr>
-        <w:t>הפיצ'ר עובר על כל האלבומים של המשתמש ומשווה</w:t>
-      </w:r>
-      <w:r>
-        <w:t>:</w:t>
-      </w:r>
-    </w:p>
-    <w:p>
-      <w:pPr>
-        <w:bidi/>
-      </w:pPr>
-      <w:proofErr w:type="spellStart"/>
-      <w:proofErr w:type="gramStart"/>
-      <w:r>
-        <w:t>album.Photos.Count</w:t>
-      </w:r>
-      <w:proofErr w:type="spellEnd"/>
-      <w:proofErr w:type="gramEnd"/>
-    </w:p>
-    <w:p>
-      <w:pPr>
-        <w:bidi/>
-      </w:pPr>
-      <w:r>
-        <w:rPr>
-          <w:rtl/>
-        </w:rPr>
-        <w:t>האלבום עם המספר הגבוה ביותר נשמר ומוחזר</w:t>
-      </w:r>
-      <w:r>
-        <w:t>.</w:t>
-      </w:r>
-    </w:p>
-    <w:p>
-      <w:pPr>
-        <w:bidi/>
-        <w:rPr>
-          <w:b/>
-          <w:bCs/>
-        </w:rPr>
-      </w:pPr>
-      <w:r>
-        <w:rPr>
-          <w:b/>
-          <w:bCs/>
-          <w:rtl/>
-        </w:rPr>
         <w:t>פלט</w:t>
       </w:r>
     </w:p>
@@ -1316,23 +1265,25 @@
     <w:tbl>
       <w:tblPr>
         <w:tblStyle w:val="TableGrid"/>
-        <w:tblW w:w="0" w:type="auto"/>
+        <w:tblW w:w="9355" w:type="dxa"/>
         <w:tblLook w:val="04A0" w:firstRow="1" w:lastRow="0" w:firstColumn="1" w:lastColumn="0" w:noHBand="0" w:noVBand="1"/>
       </w:tblPr>
       <w:tblGrid>
-        <w:gridCol w:w="5152"/>
-        <w:gridCol w:w="3023"/>
+        <w:gridCol w:w="5935"/>
+        <w:gridCol w:w="3420"/>
       </w:tblGrid>
       <w:tr>
         <w:tc>
           <w:tcPr>
-            <w:tcW w:w="0" w:type="auto"/>
+            <w:tcW w:w="5935" w:type="dxa"/>
+            <w:vAlign w:val="center"/>
             <w:hideMark/>
           </w:tcPr>
           <w:p>
             <w:pPr>
               <w:bidi/>
               <w:spacing w:after="160" w:line="278" w:lineRule="auto"/>
+              <w:jc w:val="center"/>
               <w:rPr>
                 <w:b/>
                 <w:bCs/>
@@ -1350,13 +1301,15 @@
         </w:tc>
         <w:tc>
           <w:tcPr>
-            <w:tcW w:w="0" w:type="auto"/>
+            <w:tcW w:w="3420" w:type="dxa"/>
+            <w:vAlign w:val="center"/>
             <w:hideMark/>
           </w:tcPr>
           <w:p>
             <w:pPr>
               <w:bidi/>
               <w:spacing w:after="160" w:line="278" w:lineRule="auto"/>
+              <w:jc w:val="center"/>
               <w:rPr>
                 <w:b/>
                 <w:bCs/>
@@ -1376,13 +1329,14 @@
       <w:tr>
         <w:tc>
           <w:tcPr>
-            <w:tcW w:w="0" w:type="auto"/>
+            <w:tcW w:w="5935" w:type="dxa"/>
             <w:hideMark/>
           </w:tcPr>
           <w:p>
             <w:pPr>
               <w:bidi/>
               <w:spacing w:after="160" w:line="278" w:lineRule="auto"/>
+              <w:jc w:val="right"/>
             </w:pPr>
             <w:proofErr w:type="spellStart"/>
             <w:r>
@@ -1393,7 +1347,7 @@
         </w:tc>
         <w:tc>
           <w:tcPr>
-            <w:tcW w:w="0" w:type="auto"/>
+            <w:tcW w:w="3420" w:type="dxa"/>
             <w:hideMark/>
           </w:tcPr>
           <w:p>
@@ -1413,13 +1367,14 @@
       <w:tr>
         <w:tc>
           <w:tcPr>
-            <w:tcW w:w="0" w:type="auto"/>
+            <w:tcW w:w="5935" w:type="dxa"/>
             <w:hideMark/>
           </w:tcPr>
           <w:p>
             <w:pPr>
               <w:bidi/>
               <w:spacing w:after="160" w:line="278" w:lineRule="auto"/>
+              <w:jc w:val="right"/>
             </w:pPr>
             <w:proofErr w:type="spellStart"/>
             <w:r>
@@ -1449,7 +1404,7 @@
         </w:tc>
         <w:tc>
           <w:tcPr>
-            <w:tcW w:w="0" w:type="auto"/>
+            <w:tcW w:w="3420" w:type="dxa"/>
             <w:hideMark/>
           </w:tcPr>
           <w:p>
@@ -1496,7 +1451,71 @@
         <w:rPr>
           <w:rtl/>
         </w:rPr>
-        <w:t>פיצ'ר זה סופר את מספר האלבומים הכולל של המשתמש המחובר</w:t>
+        <w:t xml:space="preserve">פיצ'ר </w:t>
+      </w:r>
+      <w:r>
+        <w:rPr>
+          <w:rFonts w:hint="cs"/>
+          <w:rtl/>
+        </w:rPr>
+        <w:t xml:space="preserve">זה </w:t>
+      </w:r>
+      <w:r>
+        <w:rPr>
+          <w:rtl/>
+        </w:rPr>
+        <w:t>סופר כמה אלבומים יש למשתמש</w:t>
+      </w:r>
+      <w:r>
+        <w:rPr>
+          <w:rFonts w:hint="cs"/>
+          <w:rtl/>
+        </w:rPr>
+        <w:t xml:space="preserve"> המחובר.</w:t>
+      </w:r>
+    </w:p>
+    <w:p>
+      <w:pPr>
+        <w:bidi/>
+        <w:rPr>
+          <w:b/>
+          <w:bCs/>
+        </w:rPr>
+      </w:pPr>
+      <w:r>
+        <w:rPr>
+          <w:b/>
+          <w:bCs/>
+          <w:rtl/>
+        </w:rPr>
+        <w:t>אופן הפעולה</w:t>
+      </w:r>
+    </w:p>
+    <w:p>
+      <w:pPr>
+        <w:bidi/>
+        <w:rPr>
+          <w:rtl/>
+        </w:rPr>
+      </w:pPr>
+      <w:r>
+        <w:rPr>
+          <w:rtl/>
+        </w:rPr>
+        <w:t>הפיצ'ר עובר על כל האלבומים</w:t>
+      </w:r>
+      <w:r>
+        <w:rPr>
+          <w:rFonts w:hint="cs"/>
+          <w:rtl/>
+        </w:rPr>
+        <w:t xml:space="preserve"> </w:t>
+      </w:r>
+      <w:r>
+        <w:rPr>
+          <w:rtl/>
+        </w:rPr>
+        <w:t>ומגדיל מונה עבור כל אלבום</w:t>
       </w:r>
       <w:r>
         <w:t>.</w:t>
@@ -1516,18 +1535,18 @@
           <w:bCs/>
           <w:rtl/>
         </w:rPr>
-        <w:t>אופן הפעולה</w:t>
-      </w:r>
-    </w:p>
-    <w:p>
-      <w:pPr>
-        <w:bidi/>
-      </w:pPr>
-      <w:r>
-        <w:rPr>
-          <w:rtl/>
-        </w:rPr>
-        <w:t>הפיצ'ר עובר על כל האלבומים</w:t>
+        <w:t>פלט</w:t>
+      </w:r>
+    </w:p>
+    <w:p>
+      <w:pPr>
+        <w:bidi/>
+      </w:pPr>
+      <w:r>
+        <w:rPr>
+          <w:rtl/>
+        </w:rPr>
+        <w:t>לאחר לחיצה על הכפתור מוצגת תווית</w:t>
       </w:r>
       <w:r>
         <w:t>:</w:t>
@@ -1535,90 +1554,54 @@
     </w:p>
     <w:p>
       <w:pPr>
-        <w:bidi/>
-      </w:pPr>
-      <w:proofErr w:type="spellStart"/>
+        <w:pStyle w:val="ListParagraph"/>
+        <w:numPr>
+          <w:ilvl w:val="0"/>
+          <w:numId w:val="10"/>
+        </w:numPr>
+        <w:bidi/>
+      </w:pPr>
+      <w:r>
+        <w:t>Albums Count: N</w:t>
+      </w:r>
+      <w:r>
+        <w:rPr>
+          <w:rFonts w:hint="cs"/>
+          <w:rtl/>
+        </w:rPr>
+        <w:t xml:space="preserve"> (</w:t>
+      </w:r>
       <w:proofErr w:type="gramStart"/>
       <w:r>
-        <w:t>user.Albums</w:t>
-      </w:r>
-      <w:proofErr w:type="spellEnd"/>
+        <w:t xml:space="preserve">N </w:t>
+      </w:r>
+      <w:r>
+        <w:rPr>
+          <w:rFonts w:hint="cs"/>
+          <w:rtl/>
+        </w:rPr>
+        <w:t xml:space="preserve"> </w:t>
+      </w:r>
+      <w:r>
+        <w:rPr>
+          <w:rFonts w:hint="cs"/>
+          <w:rtl/>
+        </w:rPr>
+        <w:t>=</w:t>
+      </w:r>
       <w:proofErr w:type="gramEnd"/>
-    </w:p>
-    <w:p>
-      <w:pPr>
-        <w:bidi/>
-      </w:pPr>
-      <w:r>
-        <w:rPr>
-          <w:rtl/>
-        </w:rPr>
-        <w:t>ומגדיל מונה עבור כל אלבום</w:t>
-      </w:r>
-      <w:r>
-        <w:t>.</w:t>
-      </w:r>
-    </w:p>
-    <w:p>
-      <w:pPr>
-        <w:bidi/>
-        <w:rPr>
-          <w:b/>
-          <w:bCs/>
-        </w:rPr>
-      </w:pPr>
-      <w:r>
-        <w:rPr>
-          <w:b/>
-          <w:bCs/>
-          <w:rtl/>
-        </w:rPr>
-        <w:t>פלט</w:t>
-      </w:r>
-    </w:p>
-    <w:p>
-      <w:pPr>
-        <w:bidi/>
-      </w:pPr>
-      <w:r>
-        <w:rPr>
-          <w:rtl/>
-        </w:rPr>
-        <w:t>לאחר לחיצה על הכפתור מוצגת תווית</w:t>
-      </w:r>
-      <w:r>
-        <w:t>:</w:t>
-      </w:r>
-    </w:p>
-    <w:p>
-      <w:pPr>
-        <w:bidi/>
-      </w:pPr>
-      <w:r>
-        <w:t>Albums Count: N</w:t>
-      </w:r>
-    </w:p>
-    <w:p>
-      <w:pPr>
-        <w:bidi/>
-      </w:pPr>
-      <w:r>
-        <w:rPr>
-          <w:rtl/>
-        </w:rPr>
-        <w:t xml:space="preserve">כאשר </w:t>
-      </w:r>
-      <w:r>
-        <w:t xml:space="preserve">N </w:t>
-      </w:r>
-      <w:r>
-        <w:rPr>
-          <w:rtl/>
-        </w:rPr>
-        <w:t>הוא מספר האלבומים שנמצא</w:t>
-      </w:r>
-      <w:r>
-        <w:t>.</w:t>
+      <w:r>
+        <w:rPr>
+          <w:rtl/>
+        </w:rPr>
+        <w:t xml:space="preserve"> מספר האלבומים שנמצא</w:t>
+      </w:r>
+      <w:r>
+        <w:rPr>
+          <w:rFonts w:hint="cs"/>
+          <w:rtl/>
+        </w:rPr>
+        <w:t>)</w:t>
       </w:r>
     </w:p>
     <w:p>
@@ -1641,23 +1624,25 @@
     <w:tbl>
       <w:tblPr>
         <w:tblStyle w:val="TableGrid"/>
-        <w:tblW w:w="0" w:type="auto"/>
+        <w:tblW w:w="9355" w:type="dxa"/>
         <w:tblLook w:val="04A0" w:firstRow="1" w:lastRow="0" w:firstColumn="1" w:lastColumn="0" w:noHBand="0" w:noVBand="1"/>
       </w:tblPr>
       <w:tblGrid>
-        <w:gridCol w:w="4673"/>
-        <w:gridCol w:w="1545"/>
+        <w:gridCol w:w="7645"/>
+        <w:gridCol w:w="1710"/>
       </w:tblGrid>
       <w:tr>
         <w:tc>
           <w:tcPr>
-            <w:tcW w:w="0" w:type="auto"/>
+            <w:tcW w:w="7645" w:type="dxa"/>
+            <w:vAlign w:val="center"/>
             <w:hideMark/>
           </w:tcPr>
           <w:p>
             <w:pPr>
               <w:bidi/>
               <w:spacing w:after="160" w:line="278" w:lineRule="auto"/>
+              <w:jc w:val="center"/>
               <w:rPr>
                 <w:b/>
                 <w:bCs/>
@@ -1675,13 +1660,15 @@
         </w:tc>
         <w:tc>
           <w:tcPr>
-            <w:tcW w:w="0" w:type="auto"/>
+            <w:tcW w:w="1710" w:type="dxa"/>
+            <w:vAlign w:val="center"/>
             <w:hideMark/>
           </w:tcPr>
           <w:p>
             <w:pPr>
               <w:bidi/>
               <w:spacing w:after="160" w:line="278" w:lineRule="auto"/>
+              <w:jc w:val="center"/>
               <w:rPr>
                 <w:b/>
                 <w:bCs/>
@@ -1701,17 +1688,18 @@
       <w:tr>
         <w:tc>
           <w:tcPr>
-            <w:tcW w:w="0" w:type="auto"/>
+            <w:tcW w:w="7645" w:type="dxa"/>
+            <w:vAlign w:val="center"/>
             <w:hideMark/>
           </w:tcPr>
           <w:p>
             <w:pPr>
               <w:bidi/>
               <w:spacing w:after="160" w:line="278" w:lineRule="auto"/>
+              <w:jc w:val="right"/>
             </w:pPr>
             <w:proofErr w:type="spellStart"/>
             <w:r>
-              <w:lastRenderedPageBreak/>
               <w:t>CountAlbumsFeature.cs</w:t>
             </w:r>
             <w:proofErr w:type="spellEnd"/>
@@ -1719,7 +1707,7 @@
         </w:tc>
         <w:tc>
           <w:tcPr>
-            <w:tcW w:w="0" w:type="auto"/>
+            <w:tcW w:w="1710" w:type="dxa"/>
             <w:hideMark/>
           </w:tcPr>
           <w:p>
@@ -1739,13 +1727,15 @@
       <w:tr>
         <w:tc>
           <w:tcPr>
-            <w:tcW w:w="0" w:type="auto"/>
+            <w:tcW w:w="7645" w:type="dxa"/>
+            <w:vAlign w:val="center"/>
             <w:hideMark/>
           </w:tcPr>
           <w:p>
             <w:pPr>
               <w:bidi/>
               <w:spacing w:after="160" w:line="278" w:lineRule="auto"/>
+              <w:jc w:val="right"/>
             </w:pPr>
             <w:proofErr w:type="spellStart"/>
             <w:r>
@@ -1775,7 +1765,7 @@
         </w:tc>
         <w:tc>
           <w:tcPr>
-            <w:tcW w:w="0" w:type="auto"/>
+            <w:tcW w:w="1710" w:type="dxa"/>
             <w:hideMark/>
           </w:tcPr>
           <w:p>
@@ -1821,215 +1811,258 @@
     <w:p>
       <w:pPr>
         <w:bidi/>
-      </w:pPr>
-      <w:r>
-        <w:rPr>
-          <w:rtl/>
-        </w:rPr>
-        <w:t>האפליקציה משתמשת ב</w:t>
+        <w:rPr>
+          <w:rtl/>
+        </w:rPr>
+      </w:pPr>
+      <w:r>
+        <w:rPr>
+          <w:rtl/>
+        </w:rPr>
+        <w:t xml:space="preserve">המחלקה </w:t>
+      </w:r>
+      <w:proofErr w:type="spellStart"/>
+      <w:r>
+        <w:rPr>
+          <w:b/>
+          <w:bCs/>
+        </w:rPr>
+        <w:t>FacebookManager</w:t>
+      </w:r>
+      <w:proofErr w:type="spellEnd"/>
+      <w:r>
+        <w:t xml:space="preserve"> </w:t>
+      </w:r>
+      <w:r>
+        <w:rPr>
+          <w:rFonts w:hint="cs"/>
+          <w:rtl/>
+        </w:rPr>
+        <w:t xml:space="preserve"> </w:t>
+      </w:r>
+      <w:r>
+        <w:rPr>
+          <w:rtl/>
+        </w:rPr>
+        <w:t xml:space="preserve">משמשת כשכבת </w:t>
+      </w:r>
+      <w:r>
+        <w:rPr>
+          <w:rFonts w:hint="cs"/>
+          <w:rtl/>
+        </w:rPr>
+        <w:t xml:space="preserve">ביניים </w:t>
+      </w:r>
+      <w:r>
+        <w:rPr>
+          <w:rtl/>
+        </w:rPr>
+        <w:t>בין האפליקציה לבין ספריית ה</w:t>
+      </w:r>
+      <w:r>
+        <w:t>Facebook API</w:t>
+      </w:r>
+      <w:r>
+        <w:rPr>
+          <w:rFonts w:hint="cs"/>
+          <w:rtl/>
+        </w:rPr>
+        <w:t>.</w:t>
+      </w:r>
+      <w:r>
+        <w:br/>
+      </w:r>
+      <w:r>
+        <w:rPr>
+          <w:rtl/>
+        </w:rPr>
+        <w:t>המחלקה מרכזת את כל פעולות ההתחברות, ניהול ה</w:t>
+      </w:r>
+      <w:r>
+        <w:t xml:space="preserve">-token </w:t>
+      </w:r>
+      <w:r>
+        <w:rPr>
+          <w:rtl/>
+        </w:rPr>
+        <w:t>והגישה למשתמש המחובר</w:t>
+      </w:r>
+      <w:r>
+        <w:rPr>
+          <w:rFonts w:hint="cs"/>
+          <w:rtl/>
+        </w:rPr>
+        <w:t xml:space="preserve"> ובכך </w:t>
+      </w:r>
+      <w:r>
+        <w:rPr>
+          <w:rtl/>
+        </w:rPr>
+        <w:t>מפרידה בין לוגיקת התקשורת עם ה</w:t>
+      </w:r>
+      <w:r>
+        <w:t xml:space="preserve">API </w:t>
+      </w:r>
+      <w:r>
+        <w:rPr>
+          <w:rtl/>
+        </w:rPr>
+        <w:t>לבין לוגיקת ה</w:t>
+      </w:r>
+      <w:r>
+        <w:t>UI</w:t>
+      </w:r>
+      <w:r>
+        <w:rPr>
+          <w:rFonts w:hint="cs"/>
+          <w:rtl/>
+        </w:rPr>
+        <w:t>.</w:t>
+      </w:r>
+    </w:p>
+    <w:p>
+      <w:pPr>
+        <w:bidi/>
+      </w:pPr>
+      <w:r>
+        <w:rPr>
+          <w:rtl/>
+        </w:rPr>
+        <w:t>כל פיצ'ר ממומש כמחלקה נפרדת שמממשת את הממשק הגנרי</w:t>
+      </w:r>
+      <w:r>
+        <w:t>:</w:t>
+      </w:r>
+    </w:p>
+    <w:p>
+      <w:r>
+        <w:lastRenderedPageBreak/>
+        <w:t xml:space="preserve">public interface </w:t>
+      </w:r>
+      <w:proofErr w:type="spellStart"/>
+      <w:r>
+        <w:t>IFacebookFeature</w:t>
+      </w:r>
+      <w:proofErr w:type="spellEnd"/>
+      <w:r>
+        <w:t>&lt;T&gt;</w:t>
+      </w:r>
+    </w:p>
+    <w:p>
+      <w:pPr>
+        <w:bidi/>
+      </w:pPr>
+      <w:r>
+        <w:rPr>
+          <w:rtl/>
+        </w:rPr>
+        <w:t>גישה זו מאפשרת</w:t>
+      </w:r>
+      <w:r>
+        <w:rPr>
+          <w:rFonts w:hint="cs"/>
+          <w:rtl/>
+        </w:rPr>
+        <w:t xml:space="preserve"> </w:t>
+      </w:r>
+      <w:r>
+        <w:rPr>
+          <w:rtl/>
+        </w:rPr>
+        <w:t xml:space="preserve">הפרדה בין </w:t>
+      </w:r>
+      <w:r>
+        <w:rPr>
+          <w:b/>
+          <w:bCs/>
+        </w:rPr>
+        <w:t xml:space="preserve">UI </w:t>
+      </w:r>
+      <w:r>
+        <w:rPr>
+          <w:rFonts w:hint="cs"/>
+          <w:b/>
+          <w:bCs/>
+          <w:rtl/>
+        </w:rPr>
+        <w:t xml:space="preserve"> </w:t>
+      </w:r>
+      <w:r>
+        <w:rPr>
+          <w:b/>
+          <w:bCs/>
+          <w:rtl/>
+        </w:rPr>
+        <w:t>לבין לוגיקה</w:t>
+      </w:r>
+      <w:r>
+        <w:rPr>
+          <w:rFonts w:hint="cs"/>
+          <w:rtl/>
+        </w:rPr>
+        <w:t>,</w:t>
+      </w:r>
+      <w:r>
+        <w:rPr>
+          <w:rFonts w:hint="cs"/>
+          <w:b/>
+          <w:bCs/>
+          <w:rtl/>
+        </w:rPr>
+        <w:t xml:space="preserve"> </w:t>
+      </w:r>
+      <w:r>
+        <w:rPr>
+          <w:rtl/>
+        </w:rPr>
+        <w:t>הרחבה קלה של האפליקציה</w:t>
+      </w:r>
+      <w:r>
+        <w:rPr>
+          <w:rFonts w:hint="cs"/>
+          <w:rtl/>
+        </w:rPr>
+        <w:t xml:space="preserve"> ו</w:t>
+      </w:r>
+      <w:r>
+        <w:rPr>
+          <w:rtl/>
+        </w:rPr>
+        <w:t>הוספת פיצ'רים חדשים ללא שינוי בקוד הקיים</w:t>
+      </w:r>
+    </w:p>
+    <w:p>
+      <w:pPr>
+        <w:bidi/>
+      </w:pPr>
+      <w:r>
+        <w:rPr>
+          <w:rtl/>
+        </w:rPr>
+        <w:t>ב</w:t>
       </w:r>
       <w:r>
         <w:t>-</w:t>
       </w:r>
-      <w:r>
-        <w:rPr>
-          <w:b/>
-          <w:bCs/>
-        </w:rPr>
-        <w:t>Strategy Design Pattern</w:t>
-      </w:r>
-      <w:r>
-        <w:t>.</w:t>
-      </w:r>
-    </w:p>
-    <w:p>
-      <w:pPr>
-        <w:bidi/>
-      </w:pPr>
-      <w:r>
-        <w:rPr>
-          <w:rtl/>
-        </w:rPr>
-        <w:t>כל פיצ'ר ממומש כמחלקה נפרדת שמממשת את הממשק הגנרי</w:t>
+      <w:proofErr w:type="spellStart"/>
+      <w:r>
+        <w:t>FormMain</w:t>
+      </w:r>
+      <w:proofErr w:type="spellEnd"/>
+      <w:r>
+        <w:t xml:space="preserve"> </w:t>
+      </w:r>
+      <w:r>
+        <w:rPr>
+          <w:rtl/>
+        </w:rPr>
+        <w:t>הפיצ'ר נבחר בזמן ריצה</w:t>
       </w:r>
       <w:r>
         <w:t>:</w:t>
       </w:r>
     </w:p>
     <w:p>
-      <w:pPr>
-        <w:bidi/>
-      </w:pPr>
-      <w:r>
-        <w:t xml:space="preserve">public interface </w:t>
-      </w:r>
-      <w:proofErr w:type="spellStart"/>
-      <w:r>
-        <w:t>IFacebookFeature</w:t>
-      </w:r>
-      <w:proofErr w:type="spellEnd"/>
-      <w:r>
-        <w:t>&lt;T&gt;</w:t>
-      </w:r>
-      <w:r>
-        <w:br/>
-        <w:t>{</w:t>
-      </w:r>
-      <w:r>
-        <w:br/>
-        <w:t xml:space="preserve">    T </w:t>
-      </w:r>
-      <w:proofErr w:type="gramStart"/>
-      <w:r>
-        <w:t>Execute(</w:t>
-      </w:r>
-      <w:proofErr w:type="gramEnd"/>
-      <w:r>
-        <w:t xml:space="preserve">User </w:t>
-      </w:r>
-      <w:proofErr w:type="spellStart"/>
-      <w:r>
-        <w:t>i_User</w:t>
-      </w:r>
-      <w:proofErr w:type="spellEnd"/>
-      <w:r>
-        <w:t>);</w:t>
-      </w:r>
-      <w:r>
-        <w:br/>
-        <w:t>}</w:t>
-      </w:r>
-    </w:p>
-    <w:p>
-      <w:pPr>
-        <w:bidi/>
-        <w:rPr>
-          <w:color w:val="EE0000"/>
-        </w:rPr>
-      </w:pPr>
-      <w:r>
-        <w:rPr>
-          <w:color w:val="EE0000"/>
-          <w:rtl/>
-        </w:rPr>
-        <w:t>גישה זו מאפשרת</w:t>
-      </w:r>
-      <w:r>
-        <w:rPr>
-          <w:color w:val="EE0000"/>
-        </w:rPr>
-        <w:t>:</w:t>
-      </w:r>
-    </w:p>
-    <w:p>
-      <w:pPr>
-        <w:numPr>
-          <w:ilvl w:val="0"/>
-          <w:numId w:val="7"/>
-        </w:numPr>
-        <w:bidi/>
-        <w:rPr>
-          <w:color w:val="EE0000"/>
-        </w:rPr>
-      </w:pPr>
-      <w:r>
-        <w:rPr>
-          <w:color w:val="EE0000"/>
-          <w:rtl/>
-        </w:rPr>
-        <w:t xml:space="preserve">הפרדה בין </w:t>
-      </w:r>
-      <w:r>
-        <w:rPr>
-          <w:b/>
-          <w:bCs/>
-          <w:color w:val="EE0000"/>
-        </w:rPr>
-        <w:t xml:space="preserve">UI </w:t>
-      </w:r>
-      <w:r>
-        <w:rPr>
-          <w:b/>
-          <w:bCs/>
-          <w:color w:val="EE0000"/>
-          <w:rtl/>
-        </w:rPr>
-        <w:t>לבין לוגיקה</w:t>
-      </w:r>
-    </w:p>
-    <w:p>
-      <w:pPr>
-        <w:numPr>
-          <w:ilvl w:val="0"/>
-          <w:numId w:val="7"/>
-        </w:numPr>
-        <w:bidi/>
-        <w:rPr>
-          <w:color w:val="EE0000"/>
-        </w:rPr>
-      </w:pPr>
-      <w:r>
-        <w:rPr>
-          <w:color w:val="EE0000"/>
-          <w:rtl/>
-        </w:rPr>
-        <w:t>הרחבה קלה של האפליקציה</w:t>
-      </w:r>
-    </w:p>
-    <w:p>
-      <w:pPr>
-        <w:numPr>
-          <w:ilvl w:val="0"/>
-          <w:numId w:val="7"/>
-        </w:numPr>
-        <w:bidi/>
-        <w:rPr>
-          <w:color w:val="EE0000"/>
-        </w:rPr>
-      </w:pPr>
-      <w:r>
-        <w:rPr>
-          <w:color w:val="EE0000"/>
-          <w:rtl/>
-        </w:rPr>
-        <w:t>הוספת פיצ'רים חדשים ללא שינוי בקוד הקיים</w:t>
-      </w:r>
-    </w:p>
-    <w:p>
-      <w:pPr>
-        <w:bidi/>
-      </w:pPr>
-      <w:r>
-        <w:rPr>
-          <w:rtl/>
-        </w:rPr>
-        <w:t>ב</w:t>
-      </w:r>
-      <w:r>
-        <w:t>-</w:t>
-      </w:r>
-      <w:proofErr w:type="spellStart"/>
-      <w:r>
-        <w:t>FormMain</w:t>
-      </w:r>
-      <w:proofErr w:type="spellEnd"/>
-      <w:r>
-        <w:t xml:space="preserve"> </w:t>
-      </w:r>
-      <w:r>
-        <w:rPr>
-          <w:rtl/>
-        </w:rPr>
-        <w:t>הפיצ'ר נבחר בזמן ריצה</w:t>
-      </w:r>
-      <w:r>
-        <w:t>:</w:t>
-      </w:r>
-    </w:p>
-    <w:p>
-      <w:pPr>
-        <w:bidi/>
-      </w:pPr>
       <w:proofErr w:type="spellStart"/>
       <w:r>
         <w:t>IFacebookFeature</w:t>
@@ -2082,9 +2115,6 @@
     <w:p>
       <w:pPr>
         <w:bidi/>
-        <w:rPr>
-          <w:rtl/>
-        </w:rPr>
       </w:pPr>
       <w:r>
         <w:rPr>
@@ -2115,6 +2145,16 @@
       </w:r>
       <w:r>
         <w:t>.</w:t>
+      </w:r>
+    </w:p>
+    <w:p>
+      <w:pPr>
+        <w:rPr>
+          <w:rtl/>
+        </w:rPr>
+      </w:pPr>
+      <w:r>
+        <w:br w:type="page"/>
       </w:r>
     </w:p>
     <w:p>
@@ -2124,33 +2164,22 @@
           <w:ilvl w:val="0"/>
           <w:numId w:val="8"/>
         </w:numPr>
-        <w:bidi/>
-        <w:rPr>
-          <w:rtl/>
-        </w:rPr>
-      </w:pPr>
-      <w:r>
-        <w:rPr>
-          <w:b/>
-          <w:bCs/>
-        </w:rPr>
+        <w:rPr>
+          <w:rtl/>
+        </w:rPr>
+      </w:pPr>
+      <w:r>
+        <w:rPr>
+          <w:b/>
+          <w:bCs/>
+        </w:rPr>
+        <w:lastRenderedPageBreak/>
         <w:t>Application Screenshots</w:t>
       </w:r>
     </w:p>
     <w:p>
-      <w:pPr>
-        <w:pStyle w:val="ListParagraph"/>
-        <w:numPr>
-          <w:ilvl w:val="0"/>
-          <w:numId w:val="9"/>
-        </w:numPr>
-        <w:bidi/>
-      </w:pPr>
-      <w:r>
-        <w:rPr>
-          <w:rtl/>
-        </w:rPr>
-        <w:t>מסך הכניסה לפני התחברות</w:t>
+      <w:r>
+        <w:t>Login screen before authentication</w:t>
       </w:r>
       <w:r>
         <w:br/>
@@ -2158,12 +2187,13 @@
       <w:r>
         <w:rPr>
           <w:rFonts w:ascii="Segoe UI Emoji" w:hAnsi="Segoe UI Emoji" w:cs="Times New Roman"/>
+          <w:noProof/>
           <w:rtl/>
         </w:rPr>
         <w:drawing>
-          <wp:inline distT="0" distB="0" distL="0" distR="0" wp14:anchorId="1C38797C" wp14:editId="0D8F2539">
-            <wp:extent cx="2878369" cy="2034540"/>
-            <wp:effectExtent l="0" t="0" r="0" b="3810"/>
+          <wp:inline distT="0" distB="0" distL="0" distR="0" wp14:anchorId="1C38797C" wp14:editId="1752ABD1">
+            <wp:extent cx="3006969" cy="2125438"/>
+            <wp:effectExtent l="0" t="0" r="3175" b="8255"/>
             <wp:docPr id="1315243902" name="Picture 1"/>
             <wp:cNvGraphicFramePr>
               <a:graphicFrameLocks xmlns:a="http://schemas.openxmlformats.org/drawingml/2006/main" noChangeAspect="1"/>
@@ -2184,7 +2214,7 @@
                   <pic:spPr>
                     <a:xfrm>
                       <a:off x="0" y="0"/>
-                      <a:ext cx="2887608" cy="2041070"/>
+                      <a:ext cx="3020887" cy="2135276"/>
                     </a:xfrm>
                     <a:prstGeom prst="rect">
                       <a:avLst/>
@@ -2198,298 +2228,22 @@
       </w:r>
     </w:p>
     <w:p>
-      <w:pPr>
-        <w:pStyle w:val="ListParagraph"/>
-        <w:numPr>
-          <w:ilvl w:val="0"/>
-          <w:numId w:val="9"/>
-        </w:numPr>
-        <w:bidi/>
-      </w:pPr>
-      <w:r>
-        <w:rPr>
-          <w:rtl/>
-        </w:rPr>
-        <w:t>מסך לאחר התחברות</w:t>
-      </w:r>
-      <w:r>
-        <w:t xml:space="preserve"> – Profile tab</w:t>
+      <w:r>
+        <w:t>Screen after login – Profile tab</w:t>
       </w:r>
       <w:r>
         <w:br/>
       </w:r>
       <w:r>
         <w:rPr>
-          <w:rtl/>
-        </w:rPr>
-        <w:t>לשים תמונה כאן</w:t>
-      </w:r>
-    </w:p>
-    <w:p>
-      <w:pPr>
-        <w:pStyle w:val="ListParagraph"/>
-        <w:numPr>
-          <w:ilvl w:val="0"/>
-          <w:numId w:val="9"/>
-        </w:numPr>
-        <w:bidi/>
-      </w:pPr>
-      <w:r>
-        <w:rPr>
-          <w:rtl/>
-        </w:rPr>
-        <w:lastRenderedPageBreak/>
-        <w:t>תוצאה של</w:t>
-      </w:r>
-      <w:r>
-        <w:t xml:space="preserve"> Most Commented Photo</w:t>
-      </w:r>
-      <w:r>
-        <w:br/>
-      </w:r>
-      <w:r>
-        <w:rPr>
-          <w:rtl/>
-        </w:rPr>
-        <w:t>לשים תמונה כאן</w:t>
-      </w:r>
-    </w:p>
-    <w:p>
-      <w:pPr>
-        <w:pStyle w:val="ListParagraph"/>
-        <w:numPr>
-          <w:ilvl w:val="0"/>
-          <w:numId w:val="9"/>
-        </w:numPr>
-        <w:bidi/>
-      </w:pPr>
-      <w:r>
-        <w:rPr>
-          <w:rtl/>
-        </w:rPr>
-        <w:t>תוצאה של</w:t>
-      </w:r>
-      <w:r>
-        <w:t xml:space="preserve"> Most Liked Photo</w:t>
-      </w:r>
-      <w:r>
-        <w:br/>
-      </w:r>
-      <w:r>
-        <w:rPr>
-          <w:rFonts w:ascii="Segoe UI Emoji" w:hAnsi="Segoe UI Emoji" w:cs="Segoe UI Emoji"/>
-        </w:rPr>
-        <w:t>📌</w:t>
-      </w:r>
-      <w:r>
-        <w:t xml:space="preserve"> </w:t>
-      </w:r>
-      <w:r>
-        <w:rPr>
-          <w:rtl/>
-        </w:rPr>
-        <w:t>לשים תמונה כאן</w:t>
-      </w:r>
-    </w:p>
-    <w:p>
-      <w:pPr>
-        <w:pStyle w:val="ListParagraph"/>
-        <w:numPr>
-          <w:ilvl w:val="0"/>
-          <w:numId w:val="9"/>
-        </w:numPr>
-        <w:bidi/>
-      </w:pPr>
-      <w:r>
-        <w:rPr>
-          <w:rtl/>
-        </w:rPr>
-        <w:t>תוצאה של</w:t>
-      </w:r>
-      <w:r>
-        <w:t xml:space="preserve"> Oldest Photo</w:t>
-      </w:r>
-      <w:r>
-        <w:br/>
-      </w:r>
-      <w:r>
-        <w:rPr>
-          <w:rFonts w:ascii="Segoe UI Emoji" w:hAnsi="Segoe UI Emoji" w:cs="Segoe UI Emoji"/>
-        </w:rPr>
-        <w:t>📌</w:t>
-      </w:r>
-      <w:r>
-        <w:t xml:space="preserve"> </w:t>
-      </w:r>
-      <w:r>
-        <w:rPr>
-          <w:rtl/>
-        </w:rPr>
-        <w:t>לשים תמונה כאן</w:t>
-      </w:r>
-    </w:p>
-    <w:p>
-      <w:pPr>
-        <w:pStyle w:val="ListParagraph"/>
-        <w:numPr>
-          <w:ilvl w:val="0"/>
-          <w:numId w:val="9"/>
-        </w:numPr>
-        <w:bidi/>
-      </w:pPr>
-      <w:r>
-        <w:rPr>
-          <w:rtl/>
-        </w:rPr>
-        <w:t>תוצאה של</w:t>
-      </w:r>
-      <w:r>
-        <w:t xml:space="preserve"> Count Albums</w:t>
-      </w:r>
-      <w:r>
-        <w:br/>
-      </w:r>
-      <w:r>
-        <w:rPr>
-          <w:rFonts w:ascii="Segoe UI Emoji" w:hAnsi="Segoe UI Emoji" w:cs="Segoe UI Emoji"/>
-        </w:rPr>
-        <w:t>📌</w:t>
-      </w:r>
-      <w:r>
-        <w:t xml:space="preserve"> </w:t>
-      </w:r>
-      <w:r>
-        <w:rPr>
-          <w:rtl/>
-        </w:rPr>
-        <w:t>לשים תמונה כאן</w:t>
-      </w:r>
-    </w:p>
-    <w:p>
-      <w:pPr>
-        <w:pStyle w:val="ListParagraph"/>
-        <w:numPr>
-          <w:ilvl w:val="0"/>
-          <w:numId w:val="9"/>
-        </w:numPr>
-        <w:bidi/>
-      </w:pPr>
-      <w:r>
-        <w:rPr>
-          <w:rtl/>
-        </w:rPr>
-        <w:t>מסך</w:t>
-      </w:r>
-      <w:r>
-        <w:t xml:space="preserve"> Analytics </w:t>
-      </w:r>
-      <w:r>
-        <w:rPr>
-          <w:rtl/>
-        </w:rPr>
-        <w:t>עם כל הכפתורים</w:t>
-      </w:r>
-      <w:r>
-        <w:br/>
-      </w:r>
-      <w:r>
-        <w:rPr>
-          <w:rFonts w:ascii="Segoe UI Emoji" w:hAnsi="Segoe UI Emoji" w:cs="Segoe UI Emoji"/>
-        </w:rPr>
-        <w:t>📌</w:t>
-      </w:r>
-      <w:r>
-        <w:t xml:space="preserve"> </w:t>
-      </w:r>
-      <w:r>
-        <w:rPr>
-          <w:rtl/>
-        </w:rPr>
-        <w:t>לשים תמונה כאן</w:t>
-      </w:r>
-    </w:p>
-    <w:p>
-      <w:pPr>
-        <w:rPr>
-          <w:rFonts w:hint="cs"/>
-          <w:rtl/>
-        </w:rPr>
-      </w:pPr>
-      <w:r>
-        <w:rPr>
-          <w:rtl/>
-        </w:rPr>
-        <w:br w:type="page"/>
-      </w:r>
-    </w:p>
-    <w:p>
-      <w:pPr>
-        <w:pStyle w:val="ListParagraph"/>
-        <w:numPr>
-          <w:ilvl w:val="0"/>
-          <w:numId w:val="8"/>
-        </w:numPr>
-        <w:bidi/>
-        <w:rPr>
-          <w:b/>
-          <w:bCs/>
-        </w:rPr>
-      </w:pPr>
-      <w:r>
-        <w:rPr>
-          <w:b/>
-          <w:bCs/>
-        </w:rPr>
-        <w:lastRenderedPageBreak/>
-        <w:t>UML Diagrams</w:t>
-      </w:r>
-    </w:p>
-    <w:p>
-      <w:pPr>
-        <w:bidi/>
-      </w:pPr>
-      <w:r>
-        <w:rPr>
-          <w:rtl/>
-        </w:rPr>
-        <w:t>יש להוסיף כאן את הדיאגרמות הבאות</w:t>
-      </w:r>
-      <w:r>
-        <w:t>:</w:t>
-      </w:r>
-    </w:p>
-    <w:p>
-      <w:pPr>
-        <w:bidi/>
-        <w:rPr>
-          <w:b/>
-          <w:bCs/>
-        </w:rPr>
-      </w:pPr>
-      <w:r>
-        <w:rPr>
-          <w:b/>
-          <w:bCs/>
-        </w:rPr>
-        <w:t>Use Case Diagram</w:t>
-      </w:r>
-    </w:p>
-    <w:p>
-      <w:pPr>
-        <w:bidi/>
-        <w:rPr>
-          <w:rtl/>
-        </w:rPr>
-      </w:pPr>
-      <w:r>
-        <w:rPr>
-          <w:noProof/>
+          <w:rFonts w:cs="Arial"/>
+          <w:rtl/>
         </w:rPr>
         <w:drawing>
-          <wp:inline distT="0" distB="0" distL="0" distR="0" wp14:anchorId="41B8CB78" wp14:editId="3A65904B">
-            <wp:extent cx="2422425" cy="5302250"/>
+          <wp:inline distT="0" distB="0" distL="0" distR="0" wp14:anchorId="17675F3D" wp14:editId="45F9C494">
+            <wp:extent cx="3686908" cy="2618650"/>
             <wp:effectExtent l="0" t="0" r="0" b="0"/>
-            <wp:docPr id="1984880755" name="Picture 2"/>
+            <wp:docPr id="750566175" name="Picture 1"/>
             <wp:cNvGraphicFramePr>
               <a:graphicFrameLocks xmlns:a="http://schemas.openxmlformats.org/drawingml/2006/main" noChangeAspect="1"/>
             </wp:cNvGraphicFramePr>
@@ -2497,36 +2251,23 @@
               <a:graphicData uri="http://schemas.openxmlformats.org/drawingml/2006/picture">
                 <pic:pic xmlns:pic="http://schemas.openxmlformats.org/drawingml/2006/picture">
                   <pic:nvPicPr>
-                    <pic:cNvPr id="0" name="Picture 3"/>
-                    <pic:cNvPicPr>
-                      <a:picLocks noChangeAspect="1" noChangeArrowheads="1"/>
-                    </pic:cNvPicPr>
+                    <pic:cNvPr id="750566175" name=""/>
+                    <pic:cNvPicPr/>
                   </pic:nvPicPr>
                   <pic:blipFill>
-                    <a:blip r:embed="rId6">
-                      <a:extLst>
-                        <a:ext uri="{28A0092B-C50C-407E-A947-70E740481C1C}">
-                          <a14:useLocalDpi xmlns:a14="http://schemas.microsoft.com/office/drawing/2010/main" val="0"/>
-                        </a:ext>
-                      </a:extLst>
-                    </a:blip>
-                    <a:srcRect/>
+                    <a:blip r:embed="rId6"/>
                     <a:stretch>
                       <a:fillRect/>
                     </a:stretch>
                   </pic:blipFill>
-                  <pic:spPr bwMode="auto">
+                  <pic:spPr>
                     <a:xfrm>
                       <a:off x="0" y="0"/>
-                      <a:ext cx="2434156" cy="5327926"/>
+                      <a:ext cx="3702301" cy="2629583"/>
                     </a:xfrm>
                     <a:prstGeom prst="rect">
                       <a:avLst/>
                     </a:prstGeom>
-                    <a:noFill/>
-                    <a:ln>
-                      <a:noFill/>
-                    </a:ln>
                   </pic:spPr>
                 </pic:pic>
               </a:graphicData>
@@ -2534,6 +2275,277 @@
           </wp:inline>
         </w:drawing>
       </w:r>
+    </w:p>
+    <w:p>
+      <w:pPr>
+        <w:bidi/>
+        <w:rPr>
+          <w:rtl/>
+        </w:rPr>
+      </w:pPr>
+    </w:p>
+    <w:p>
+      <w:r>
+        <w:t>Album &amp; photos tab</w:t>
+      </w:r>
+    </w:p>
+    <w:p>
+      <w:r>
+        <w:rPr>
+          <w:rFonts w:cs="Arial"/>
+          <w:rtl/>
+        </w:rPr>
+        <w:lastRenderedPageBreak/>
+        <w:drawing>
+          <wp:inline distT="0" distB="0" distL="0" distR="0" wp14:anchorId="43B71F8A" wp14:editId="259E6E72">
+            <wp:extent cx="4056991" cy="2889738"/>
+            <wp:effectExtent l="0" t="0" r="1270" b="6350"/>
+            <wp:docPr id="19718121" name="Picture 1"/>
+            <wp:cNvGraphicFramePr>
+              <a:graphicFrameLocks xmlns:a="http://schemas.openxmlformats.org/drawingml/2006/main" noChangeAspect="1"/>
+            </wp:cNvGraphicFramePr>
+            <a:graphic xmlns:a="http://schemas.openxmlformats.org/drawingml/2006/main">
+              <a:graphicData uri="http://schemas.openxmlformats.org/drawingml/2006/picture">
+                <pic:pic xmlns:pic="http://schemas.openxmlformats.org/drawingml/2006/picture">
+                  <pic:nvPicPr>
+                    <pic:cNvPr id="19718121" name=""/>
+                    <pic:cNvPicPr/>
+                  </pic:nvPicPr>
+                  <pic:blipFill>
+                    <a:blip r:embed="rId7"/>
+                    <a:stretch>
+                      <a:fillRect/>
+                    </a:stretch>
+                  </pic:blipFill>
+                  <pic:spPr>
+                    <a:xfrm>
+                      <a:off x="0" y="0"/>
+                      <a:ext cx="4078181" cy="2904831"/>
+                    </a:xfrm>
+                    <a:prstGeom prst="rect">
+                      <a:avLst/>
+                    </a:prstGeom>
+                  </pic:spPr>
+                </pic:pic>
+              </a:graphicData>
+            </a:graphic>
+          </wp:inline>
+        </w:drawing>
+      </w:r>
+    </w:p>
+    <w:p>
+      <w:pPr>
+        <w:rPr>
+          <w:rtl/>
+        </w:rPr>
+      </w:pPr>
+      <w:r>
+        <w:t xml:space="preserve">After </w:t>
+      </w:r>
+      <w:r>
+        <w:t xml:space="preserve">clicking </w:t>
+      </w:r>
+      <w:r>
+        <w:t>Oldest Photo and Album with most photos</w:t>
+      </w:r>
+    </w:p>
+    <w:p>
+      <w:r>
+        <w:rPr>
+          <w:rFonts w:cs="Arial"/>
+          <w:rtl/>
+        </w:rPr>
+        <w:drawing>
+          <wp:inline distT="0" distB="0" distL="0" distR="0" wp14:anchorId="13A8BC5A" wp14:editId="69E62896">
+            <wp:extent cx="4337538" cy="3082619"/>
+            <wp:effectExtent l="0" t="0" r="6350" b="3810"/>
+            <wp:docPr id="260052224" name="Picture 1"/>
+            <wp:cNvGraphicFramePr>
+              <a:graphicFrameLocks xmlns:a="http://schemas.openxmlformats.org/drawingml/2006/main" noChangeAspect="1"/>
+            </wp:cNvGraphicFramePr>
+            <a:graphic xmlns:a="http://schemas.openxmlformats.org/drawingml/2006/main">
+              <a:graphicData uri="http://schemas.openxmlformats.org/drawingml/2006/picture">
+                <pic:pic xmlns:pic="http://schemas.openxmlformats.org/drawingml/2006/picture">
+                  <pic:nvPicPr>
+                    <pic:cNvPr id="260052224" name=""/>
+                    <pic:cNvPicPr/>
+                  </pic:nvPicPr>
+                  <pic:blipFill>
+                    <a:blip r:embed="rId8"/>
+                    <a:stretch>
+                      <a:fillRect/>
+                    </a:stretch>
+                  </pic:blipFill>
+                  <pic:spPr>
+                    <a:xfrm>
+                      <a:off x="0" y="0"/>
+                      <a:ext cx="4342034" cy="3085814"/>
+                    </a:xfrm>
+                    <a:prstGeom prst="rect">
+                      <a:avLst/>
+                    </a:prstGeom>
+                  </pic:spPr>
+                </pic:pic>
+              </a:graphicData>
+            </a:graphic>
+          </wp:inline>
+        </w:drawing>
+      </w:r>
+    </w:p>
+    <w:p>
+      <w:pPr>
+        <w:bidi/>
+      </w:pPr>
+    </w:p>
+    <w:p>
+      <w:r>
+        <w:t>Analytics</w:t>
+      </w:r>
+    </w:p>
+    <w:p>
+      <w:r>
+        <w:rPr>
+          <w:rFonts w:cs="Arial"/>
+          <w:rtl/>
+        </w:rPr>
+        <w:lastRenderedPageBreak/>
+        <w:drawing>
+          <wp:inline distT="0" distB="0" distL="0" distR="0" wp14:anchorId="40F02FB3" wp14:editId="4B951C91">
+            <wp:extent cx="4861785" cy="3458308"/>
+            <wp:effectExtent l="0" t="0" r="0" b="8890"/>
+            <wp:docPr id="1847843270" name="Picture 1"/>
+            <wp:cNvGraphicFramePr>
+              <a:graphicFrameLocks xmlns:a="http://schemas.openxmlformats.org/drawingml/2006/main" noChangeAspect="1"/>
+            </wp:cNvGraphicFramePr>
+            <a:graphic xmlns:a="http://schemas.openxmlformats.org/drawingml/2006/main">
+              <a:graphicData uri="http://schemas.openxmlformats.org/drawingml/2006/picture">
+                <pic:pic xmlns:pic="http://schemas.openxmlformats.org/drawingml/2006/picture">
+                  <pic:nvPicPr>
+                    <pic:cNvPr id="1847843270" name=""/>
+                    <pic:cNvPicPr/>
+                  </pic:nvPicPr>
+                  <pic:blipFill>
+                    <a:blip r:embed="rId9"/>
+                    <a:stretch>
+                      <a:fillRect/>
+                    </a:stretch>
+                  </pic:blipFill>
+                  <pic:spPr>
+                    <a:xfrm>
+                      <a:off x="0" y="0"/>
+                      <a:ext cx="4866699" cy="3461804"/>
+                    </a:xfrm>
+                    <a:prstGeom prst="rect">
+                      <a:avLst/>
+                    </a:prstGeom>
+                  </pic:spPr>
+                </pic:pic>
+              </a:graphicData>
+            </a:graphic>
+          </wp:inline>
+        </w:drawing>
+      </w:r>
+    </w:p>
+    <w:p>
+      <w:pPr>
+        <w:rPr>
+          <w:rtl/>
+        </w:rPr>
+      </w:pPr>
+      <w:r>
+        <w:t>After clicking on the button in Analytics tab</w:t>
+      </w:r>
+      <w:r>
+        <w:rPr>
+          <w:rFonts w:cs="Arial"/>
+          <w:rtl/>
+        </w:rPr>
+        <w:drawing>
+          <wp:inline distT="0" distB="0" distL="0" distR="0" wp14:anchorId="24BBC6E1" wp14:editId="522DBB06">
+            <wp:extent cx="4351370" cy="3053862"/>
+            <wp:effectExtent l="0" t="0" r="0" b="0"/>
+            <wp:docPr id="1342637364" name="Picture 1"/>
+            <wp:cNvGraphicFramePr>
+              <a:graphicFrameLocks xmlns:a="http://schemas.openxmlformats.org/drawingml/2006/main" noChangeAspect="1"/>
+            </wp:cNvGraphicFramePr>
+            <a:graphic xmlns:a="http://schemas.openxmlformats.org/drawingml/2006/main">
+              <a:graphicData uri="http://schemas.openxmlformats.org/drawingml/2006/picture">
+                <pic:pic xmlns:pic="http://schemas.openxmlformats.org/drawingml/2006/picture">
+                  <pic:nvPicPr>
+                    <pic:cNvPr id="1342637364" name=""/>
+                    <pic:cNvPicPr/>
+                  </pic:nvPicPr>
+                  <pic:blipFill>
+                    <a:blip r:embed="rId10"/>
+                    <a:stretch>
+                      <a:fillRect/>
+                    </a:stretch>
+                  </pic:blipFill>
+                  <pic:spPr>
+                    <a:xfrm>
+                      <a:off x="0" y="0"/>
+                      <a:ext cx="4357027" cy="3057832"/>
+                    </a:xfrm>
+                    <a:prstGeom prst="rect">
+                      <a:avLst/>
+                    </a:prstGeom>
+                  </pic:spPr>
+                </pic:pic>
+              </a:graphicData>
+            </a:graphic>
+          </wp:inline>
+        </w:drawing>
+      </w:r>
+      <w:r>
+        <w:rPr>
+          <w:rtl/>
+        </w:rPr>
+        <w:br w:type="page"/>
+      </w:r>
+    </w:p>
+    <w:p>
+      <w:pPr>
+        <w:pStyle w:val="ListParagraph"/>
+        <w:numPr>
+          <w:ilvl w:val="0"/>
+          <w:numId w:val="8"/>
+        </w:numPr>
+        <w:rPr>
+          <w:b/>
+          <w:bCs/>
+        </w:rPr>
+      </w:pPr>
+      <w:r>
+        <w:rPr>
+          <w:b/>
+          <w:bCs/>
+        </w:rPr>
+        <w:lastRenderedPageBreak/>
+        <w:t>UML Diagrams</w:t>
+      </w:r>
+    </w:p>
+    <w:p>
+      <w:pPr>
+        <w:rPr>
+          <w:b/>
+          <w:bCs/>
+        </w:rPr>
+      </w:pPr>
+      <w:r>
+        <w:rPr>
+          <w:b/>
+          <w:bCs/>
+        </w:rPr>
+        <w:t>Use Case Diagram</w:t>
+      </w:r>
+    </w:p>
+    <w:p>
+      <w:pPr>
+        <w:bidi/>
+        <w:rPr>
+          <w:rtl/>
+        </w:rPr>
+      </w:pPr>
       <w:r>
         <w:rPr>
           <w:noProof/>
@@ -2562,7 +2574,7 @@
                     </pic:cNvPicPr>
                   </pic:nvPicPr>
                   <pic:blipFill>
-                    <a:blip r:embed="rId7" cstate="print">
+                    <a:blip r:embed="rId11" cstate="print">
                       <a:extLst>
                         <a:ext uri="{28A0092B-C50C-407E-A947-70E740481C1C}">
                           <a14:useLocalDpi xmlns:a14="http://schemas.microsoft.com/office/drawing/2010/main" val="0"/>
@@ -2601,18 +2613,48 @@
     </w:p>
     <w:p>
       <w:pPr>
-        <w:bidi/>
-        <w:rPr>
-          <w:b/>
-          <w:bCs/>
-        </w:rPr>
-      </w:pPr>
-      <w:r>
-        <w:rPr>
-          <w:b/>
-          <w:bCs/>
-        </w:rPr>
+        <w:rPr>
+          <w:b/>
+          <w:bCs/>
+        </w:rPr>
+      </w:pPr>
+      <w:r>
+        <w:rPr>
+          <w:b/>
+          <w:bCs/>
+        </w:rPr>
+        <w:br w:type="page"/>
+      </w:r>
+    </w:p>
+    <w:p>
+      <w:pPr>
+        <w:rPr>
+          <w:b/>
+          <w:bCs/>
+        </w:rPr>
+      </w:pPr>
+      <w:r>
+        <w:rPr>
+          <w:b/>
+          <w:bCs/>
+        </w:rPr>
+        <w:lastRenderedPageBreak/>
         <w:t>Sequence Diagram — Count Albums</w:t>
+      </w:r>
+    </w:p>
+    <w:p>
+      <w:pPr>
+        <w:rPr>
+          <w:b/>
+          <w:bCs/>
+        </w:rPr>
+      </w:pPr>
+      <w:r>
+        <w:rPr>
+          <w:b/>
+          <w:bCs/>
+        </w:rPr>
+        <w:br w:type="page"/>
       </w:r>
     </w:p>
     <w:p>
@@ -2642,7 +2684,7 @@
                     </pic:cNvPicPr>
                   </pic:nvPicPr>
                   <pic:blipFill>
-                    <a:blip r:embed="rId8">
+                    <a:blip r:embed="rId12">
                       <a:extLst>
                         <a:ext uri="{28A0092B-C50C-407E-A947-70E740481C1C}">
                           <a14:useLocalDpi xmlns:a14="http://schemas.microsoft.com/office/drawing/2010/main" val="0"/>
@@ -2680,13 +2722,40 @@
         <w:rPr>
           <w:b/>
           <w:bCs/>
-        </w:rPr>
-      </w:pPr>
-      <w:r>
-        <w:rPr>
-          <w:b/>
-          <w:bCs/>
-        </w:rPr>
+          <w:rtl/>
+        </w:rPr>
+      </w:pPr>
+    </w:p>
+    <w:p>
+      <w:pPr>
+        <w:rPr>
+          <w:b/>
+          <w:bCs/>
+          <w:rtl/>
+        </w:rPr>
+      </w:pPr>
+      <w:r>
+        <w:rPr>
+          <w:b/>
+          <w:bCs/>
+          <w:rtl/>
+        </w:rPr>
+        <w:br w:type="page"/>
+      </w:r>
+    </w:p>
+    <w:p>
+      <w:pPr>
+        <w:rPr>
+          <w:b/>
+          <w:bCs/>
+        </w:rPr>
+      </w:pPr>
+      <w:r>
+        <w:rPr>
+          <w:b/>
+          <w:bCs/>
+        </w:rPr>
+        <w:lastRenderedPageBreak/>
         <w:t>Sequence Diagram — Most Commented Photo</w:t>
       </w:r>
     </w:p>
@@ -2698,7 +2767,6 @@
         <w:rPr>
           <w:noProof/>
         </w:rPr>
-        <w:lastRenderedPageBreak/>
         <w:drawing>
           <wp:inline distT="0" distB="0" distL="0" distR="0" wp14:anchorId="366279C0" wp14:editId="76046A0C">
             <wp:extent cx="5943600" cy="5042535"/>
@@ -2717,7 +2785,7 @@
                     </pic:cNvPicPr>
                   </pic:nvPicPr>
                   <pic:blipFill>
-                    <a:blip r:embed="rId9">
+                    <a:blip r:embed="rId13">
                       <a:extLst>
                         <a:ext uri="{28A0092B-C50C-407E-A947-70E740481C1C}">
                           <a14:useLocalDpi xmlns:a14="http://schemas.microsoft.com/office/drawing/2010/main" val="0"/>
@@ -2755,13 +2823,40 @@
         <w:rPr>
           <w:b/>
           <w:bCs/>
-        </w:rPr>
-      </w:pPr>
-      <w:r>
-        <w:rPr>
-          <w:b/>
-          <w:bCs/>
-        </w:rPr>
+          <w:rtl/>
+        </w:rPr>
+      </w:pPr>
+    </w:p>
+    <w:p>
+      <w:pPr>
+        <w:rPr>
+          <w:b/>
+          <w:bCs/>
+          <w:rtl/>
+        </w:rPr>
+      </w:pPr>
+      <w:r>
+        <w:rPr>
+          <w:b/>
+          <w:bCs/>
+          <w:rtl/>
+        </w:rPr>
+        <w:br w:type="page"/>
+      </w:r>
+    </w:p>
+    <w:p>
+      <w:pPr>
+        <w:rPr>
+          <w:b/>
+          <w:bCs/>
+        </w:rPr>
+      </w:pPr>
+      <w:r>
+        <w:rPr>
+          <w:b/>
+          <w:bCs/>
+        </w:rPr>
+        <w:lastRenderedPageBreak/>
         <w:t>Class Diagram</w:t>
       </w:r>
     </w:p>
@@ -2772,16 +2867,23 @@
           <w:rtl/>
         </w:rPr>
       </w:pPr>
+    </w:p>
+    <w:p>
+      <w:pPr>
+        <w:bidi/>
+        <w:rPr>
+          <w:rtl/>
+        </w:rPr>
+      </w:pPr>
       <w:r>
         <w:rPr>
           <w:noProof/>
         </w:rPr>
-        <w:lastRenderedPageBreak/>
         <w:drawing>
-          <wp:inline distT="0" distB="0" distL="0" distR="0" wp14:anchorId="3D85C9F3" wp14:editId="104B21CC">
-            <wp:extent cx="5943600" cy="3908425"/>
-            <wp:effectExtent l="0" t="0" r="0" b="0"/>
-            <wp:docPr id="875258640" name="Picture 4"/>
+          <wp:inline distT="0" distB="0" distL="0" distR="0" wp14:anchorId="3CBBE1B4" wp14:editId="2C9F5971">
+            <wp:extent cx="5943600" cy="3955415"/>
+            <wp:effectExtent l="0" t="0" r="0" b="6985"/>
+            <wp:docPr id="1143873470" name="Picture 1"/>
             <wp:cNvGraphicFramePr>
               <a:graphicFrameLocks xmlns:a="http://schemas.openxmlformats.org/drawingml/2006/main" noChangeAspect="1"/>
             </wp:cNvGraphicFramePr>
@@ -2789,13 +2891,13 @@
               <a:graphicData uri="http://schemas.openxmlformats.org/drawingml/2006/picture">
                 <pic:pic xmlns:pic="http://schemas.openxmlformats.org/drawingml/2006/picture">
                   <pic:nvPicPr>
-                    <pic:cNvPr id="0" name="Picture 7"/>
+                    <pic:cNvPr id="0" name="Picture 1"/>
                     <pic:cNvPicPr>
                       <a:picLocks noChangeAspect="1" noChangeArrowheads="1"/>
                     </pic:cNvPicPr>
                   </pic:nvPicPr>
                   <pic:blipFill>
-                    <a:blip r:embed="rId10" cstate="print">
+                    <a:blip r:embed="rId14" cstate="print">
                       <a:extLst>
                         <a:ext uri="{28A0092B-C50C-407E-A947-70E740481C1C}">
                           <a14:useLocalDpi xmlns:a14="http://schemas.microsoft.com/office/drawing/2010/main" val="0"/>
@@ -2810,7 +2912,7 @@
                   <pic:spPr bwMode="auto">
                     <a:xfrm>
                       <a:off x="0" y="0"/>
-                      <a:ext cx="5943600" cy="3908425"/>
+                      <a:ext cx="5943600" cy="3955415"/>
                     </a:xfrm>
                     <a:prstGeom prst="rect">
                       <a:avLst/>
@@ -2835,133 +2937,7 @@
         </w:rPr>
       </w:pPr>
     </w:p>
-    <w:p>
-      <w:pPr>
-        <w:rPr>
-          <w:rtl/>
-        </w:rPr>
-      </w:pPr>
-      <w:r>
-        <w:rPr>
-          <w:rtl/>
-        </w:rPr>
-        <w:br w:type="page"/>
-      </w:r>
-    </w:p>
-    <w:p>
-      <w:pPr>
-        <w:bidi/>
-        <w:rPr>
-          <w:rtl/>
-        </w:rPr>
-      </w:pPr>
-      <w:r>
-        <w:rPr>
-          <w:rFonts w:hint="cs"/>
-          <w:rtl/>
-        </w:rPr>
-        <w:lastRenderedPageBreak/>
-        <w:t>למחיקה?</w:t>
-      </w:r>
-    </w:p>
-    <w:p>
-      <w:pPr>
-        <w:bidi/>
-        <w:rPr>
-          <w:rtl/>
-        </w:rPr>
-      </w:pPr>
-      <w:r>
-        <w:rPr>
-          <w:rFonts w:cs="Arial"/>
-          <w:rtl/>
-        </w:rPr>
-        <w:drawing>
-          <wp:inline distT="0" distB="0" distL="0" distR="0" wp14:anchorId="72D7A233" wp14:editId="421CCC1A">
-            <wp:extent cx="5943600" cy="1038225"/>
-            <wp:effectExtent l="0" t="0" r="0" b="9525"/>
-            <wp:docPr id="810988094" name="Picture 1"/>
-            <wp:cNvGraphicFramePr>
-              <a:graphicFrameLocks xmlns:a="http://schemas.openxmlformats.org/drawingml/2006/main" noChangeAspect="1"/>
-            </wp:cNvGraphicFramePr>
-            <a:graphic xmlns:a="http://schemas.openxmlformats.org/drawingml/2006/main">
-              <a:graphicData uri="http://schemas.openxmlformats.org/drawingml/2006/picture">
-                <pic:pic xmlns:pic="http://schemas.openxmlformats.org/drawingml/2006/picture">
-                  <pic:nvPicPr>
-                    <pic:cNvPr id="810988094" name=""/>
-                    <pic:cNvPicPr/>
-                  </pic:nvPicPr>
-                  <pic:blipFill>
-                    <a:blip r:embed="rId11"/>
-                    <a:stretch>
-                      <a:fillRect/>
-                    </a:stretch>
-                  </pic:blipFill>
-                  <pic:spPr>
-                    <a:xfrm>
-                      <a:off x="0" y="0"/>
-                      <a:ext cx="5943600" cy="1038225"/>
-                    </a:xfrm>
-                    <a:prstGeom prst="rect">
-                      <a:avLst/>
-                    </a:prstGeom>
-                  </pic:spPr>
-                </pic:pic>
-              </a:graphicData>
-            </a:graphic>
-          </wp:inline>
-        </w:drawing>
-      </w:r>
-    </w:p>
-    <w:p>
-      <w:pPr>
-        <w:bidi/>
-        <w:rPr>
-          <w:rFonts w:hint="cs"/>
-        </w:rPr>
-      </w:pPr>
-      <w:r>
-        <w:rPr>
-          <w:rFonts w:cs="Arial"/>
-          <w:rtl/>
-        </w:rPr>
-        <w:drawing>
-          <wp:inline distT="0" distB="0" distL="0" distR="0" wp14:anchorId="197F32ED" wp14:editId="219D3DB9">
-            <wp:extent cx="5943600" cy="2828925"/>
-            <wp:effectExtent l="0" t="0" r="0" b="9525"/>
-            <wp:docPr id="1051952985" name="Picture 1"/>
-            <wp:cNvGraphicFramePr>
-              <a:graphicFrameLocks xmlns:a="http://schemas.openxmlformats.org/drawingml/2006/main" noChangeAspect="1"/>
-            </wp:cNvGraphicFramePr>
-            <a:graphic xmlns:a="http://schemas.openxmlformats.org/drawingml/2006/main">
-              <a:graphicData uri="http://schemas.openxmlformats.org/drawingml/2006/picture">
-                <pic:pic xmlns:pic="http://schemas.openxmlformats.org/drawingml/2006/picture">
-                  <pic:nvPicPr>
-                    <pic:cNvPr id="1051952985" name=""/>
-                    <pic:cNvPicPr/>
-                  </pic:nvPicPr>
-                  <pic:blipFill>
-                    <a:blip r:embed="rId12"/>
-                    <a:stretch>
-                      <a:fillRect/>
-                    </a:stretch>
-                  </pic:blipFill>
-                  <pic:spPr>
-                    <a:xfrm>
-                      <a:off x="0" y="0"/>
-                      <a:ext cx="5943600" cy="2828925"/>
-                    </a:xfrm>
-                    <a:prstGeom prst="rect">
-                      <a:avLst/>
-                    </a:prstGeom>
-                  </pic:spPr>
-                </pic:pic>
-              </a:graphicData>
-            </a:graphic>
-          </wp:inline>
-        </w:drawing>
-      </w:r>
-    </w:p>
+    <w:p/>
     <w:sectPr>
       <w:pgSz w:w="12240" w:h="15840"/>
       <w:pgMar w:top="1440" w:right="1440" w:bottom="1440" w:left="1440" w:header="720" w:footer="720" w:gutter="0"/>
@@ -3088,6 +3064,119 @@
     </w:lvl>
   </w:abstractNum>
   <w:abstractNum w:abstractNumId="1" w15:restartNumberingAfterBreak="0">
+    <w:nsid w:val="2BAF1199"/>
+    <w:multiLevelType w:val="hybridMultilevel"/>
+    <w:tmpl w:val="8C807E36"/>
+    <w:lvl w:ilvl="0" w:tplc="04090001">
+      <w:start w:val="1"/>
+      <w:numFmt w:val="bullet"/>
+      <w:lvlText w:val=""/>
+      <w:lvlJc w:val="left"/>
+      <w:pPr>
+        <w:ind w:left="720" w:hanging="360"/>
+      </w:pPr>
+      <w:rPr>
+        <w:rFonts w:ascii="Symbol" w:hAnsi="Symbol" w:hint="default"/>
+      </w:rPr>
+    </w:lvl>
+    <w:lvl w:ilvl="1" w:tplc="04090003" w:tentative="1">
+      <w:start w:val="1"/>
+      <w:numFmt w:val="bullet"/>
+      <w:lvlText w:val="o"/>
+      <w:lvlJc w:val="left"/>
+      <w:pPr>
+        <w:ind w:left="1440" w:hanging="360"/>
+      </w:pPr>
+      <w:rPr>
+        <w:rFonts w:ascii="Courier New" w:hAnsi="Courier New" w:cs="Courier New" w:hint="default"/>
+      </w:rPr>
+    </w:lvl>
+    <w:lvl w:ilvl="2" w:tplc="04090005" w:tentative="1">
+      <w:start w:val="1"/>
+      <w:numFmt w:val="bullet"/>
+      <w:lvlText w:val=""/>
+      <w:lvlJc w:val="left"/>
+      <w:pPr>
+        <w:ind w:left="2160" w:hanging="360"/>
+      </w:pPr>
+      <w:rPr>
+        <w:rFonts w:ascii="Wingdings" w:hAnsi="Wingdings" w:hint="default"/>
+      </w:rPr>
+    </w:lvl>
+    <w:lvl w:ilvl="3" w:tplc="04090001" w:tentative="1">
+      <w:start w:val="1"/>
+      <w:numFmt w:val="bullet"/>
+      <w:lvlText w:val=""/>
+      <w:lvlJc w:val="left"/>
+      <w:pPr>
+        <w:ind w:left="2880" w:hanging="360"/>
+      </w:pPr>
+      <w:rPr>
+        <w:rFonts w:ascii="Symbol" w:hAnsi="Symbol" w:hint="default"/>
+      </w:rPr>
+    </w:lvl>
+    <w:lvl w:ilvl="4" w:tplc="04090003" w:tentative="1">
+      <w:start w:val="1"/>
+      <w:numFmt w:val="bullet"/>
+      <w:lvlText w:val="o"/>
+      <w:lvlJc w:val="left"/>
+      <w:pPr>
+        <w:ind w:left="3600" w:hanging="360"/>
+      </w:pPr>
+      <w:rPr>
+        <w:rFonts w:ascii="Courier New" w:hAnsi="Courier New" w:cs="Courier New" w:hint="default"/>
+      </w:rPr>
+    </w:lvl>
+    <w:lvl w:ilvl="5" w:tplc="04090005" w:tentative="1">
+      <w:start w:val="1"/>
+      <w:numFmt w:val="bullet"/>
+      <w:lvlText w:val=""/>
+      <w:lvlJc w:val="left"/>
+      <w:pPr>
+        <w:ind w:left="4320" w:hanging="360"/>
+      </w:pPr>
+      <w:rPr>
+        <w:rFonts w:ascii="Wingdings" w:hAnsi="Wingdings" w:hint="default"/>
+      </w:rPr>
+    </w:lvl>
+    <w:lvl w:ilvl="6" w:tplc="04090001" w:tentative="1">
+      <w:start w:val="1"/>
+      <w:numFmt w:val="bullet"/>
+      <w:lvlText w:val=""/>
+      <w:lvlJc w:val="left"/>
+      <w:pPr>
+        <w:ind w:left="5040" w:hanging="360"/>
+      </w:pPr>
+      <w:rPr>
+        <w:rFonts w:ascii="Symbol" w:hAnsi="Symbol" w:hint="default"/>
+      </w:rPr>
+    </w:lvl>
+    <w:lvl w:ilvl="7" w:tplc="04090003" w:tentative="1">
+      <w:start w:val="1"/>
+      <w:numFmt w:val="bullet"/>
+      <w:lvlText w:val="o"/>
+      <w:lvlJc w:val="left"/>
+      <w:pPr>
+        <w:ind w:left="5760" w:hanging="360"/>
+      </w:pPr>
+      <w:rPr>
+        <w:rFonts w:ascii="Courier New" w:hAnsi="Courier New" w:cs="Courier New" w:hint="default"/>
+      </w:rPr>
+    </w:lvl>
+    <w:lvl w:ilvl="8" w:tplc="04090005" w:tentative="1">
+      <w:start w:val="1"/>
+      <w:numFmt w:val="bullet"/>
+      <w:lvlText w:val=""/>
+      <w:lvlJc w:val="left"/>
+      <w:pPr>
+        <w:ind w:left="6480" w:hanging="360"/>
+      </w:pPr>
+      <w:rPr>
+        <w:rFonts w:ascii="Wingdings" w:hAnsi="Wingdings" w:hint="default"/>
+      </w:rPr>
+    </w:lvl>
+  </w:abstractNum>
+  <w:abstractNum w:abstractNumId="2" w15:restartNumberingAfterBreak="0">
     <w:nsid w:val="3C960F1D"/>
     <w:multiLevelType w:val="multilevel"/>
     <w:tmpl w:val="09BCD0C0"/>
@@ -3236,7 +3325,7 @@
       </w:rPr>
     </w:lvl>
   </w:abstractNum>
-  <w:abstractNum w:abstractNumId="2" w15:restartNumberingAfterBreak="0">
+  <w:abstractNum w:abstractNumId="3" w15:restartNumberingAfterBreak="0">
     <w:nsid w:val="426A1EA6"/>
     <w:multiLevelType w:val="multilevel"/>
     <w:tmpl w:val="EB026208"/>
@@ -3385,7 +3474,7 @@
       </w:rPr>
     </w:lvl>
   </w:abstractNum>
-  <w:abstractNum w:abstractNumId="3" w15:restartNumberingAfterBreak="0">
+  <w:abstractNum w:abstractNumId="4" w15:restartNumberingAfterBreak="0">
     <w:nsid w:val="430F59AB"/>
     <w:multiLevelType w:val="hybridMultilevel"/>
     <w:tmpl w:val="407652B8"/>
@@ -3476,7 +3565,7 @@
       </w:pPr>
     </w:lvl>
   </w:abstractNum>
-  <w:abstractNum w:abstractNumId="4" w15:restartNumberingAfterBreak="0">
+  <w:abstractNum w:abstractNumId="5" w15:restartNumberingAfterBreak="0">
     <w:nsid w:val="537274A3"/>
     <w:multiLevelType w:val="multilevel"/>
     <w:tmpl w:val="E2D6E982"/>
@@ -3625,7 +3714,7 @@
       </w:rPr>
     </w:lvl>
   </w:abstractNum>
-  <w:abstractNum w:abstractNumId="5" w15:restartNumberingAfterBreak="0">
+  <w:abstractNum w:abstractNumId="6" w15:restartNumberingAfterBreak="0">
     <w:nsid w:val="5C0D171F"/>
     <w:multiLevelType w:val="multilevel"/>
     <w:tmpl w:val="7804C69A"/>
@@ -3774,7 +3863,7 @@
       </w:rPr>
     </w:lvl>
   </w:abstractNum>
-  <w:abstractNum w:abstractNumId="6" w15:restartNumberingAfterBreak="0">
+  <w:abstractNum w:abstractNumId="7" w15:restartNumberingAfterBreak="0">
     <w:nsid w:val="5DC47CF7"/>
     <w:multiLevelType w:val="multilevel"/>
     <w:tmpl w:val="C764D948"/>
@@ -3887,7 +3976,7 @@
       </w:pPr>
     </w:lvl>
   </w:abstractNum>
-  <w:abstractNum w:abstractNumId="7" w15:restartNumberingAfterBreak="0">
+  <w:abstractNum w:abstractNumId="8" w15:restartNumberingAfterBreak="0">
     <w:nsid w:val="5F311C41"/>
     <w:multiLevelType w:val="multilevel"/>
     <w:tmpl w:val="58623022"/>
@@ -4036,7 +4125,7 @@
       </w:rPr>
     </w:lvl>
   </w:abstractNum>
-  <w:abstractNum w:abstractNumId="8" w15:restartNumberingAfterBreak="0">
+  <w:abstractNum w:abstractNumId="9" w15:restartNumberingAfterBreak="0">
     <w:nsid w:val="6E340D62"/>
     <w:multiLevelType w:val="multilevel"/>
     <w:tmpl w:val="52666F9A"/>
@@ -4186,31 +4275,34 @@
     </w:lvl>
   </w:abstractNum>
   <w:num w:numId="1" w16cid:durableId="1907955928">
-    <w:abstractNumId w:val="1"/>
+    <w:abstractNumId w:val="2"/>
   </w:num>
   <w:num w:numId="2" w16cid:durableId="555513279">
+    <w:abstractNumId w:val="7"/>
+  </w:num>
+  <w:num w:numId="3" w16cid:durableId="1626958236">
+    <w:abstractNumId w:val="9"/>
+  </w:num>
+  <w:num w:numId="4" w16cid:durableId="1941402265">
+    <w:abstractNumId w:val="5"/>
+  </w:num>
+  <w:num w:numId="5" w16cid:durableId="456412381">
+    <w:abstractNumId w:val="3"/>
+  </w:num>
+  <w:num w:numId="6" w16cid:durableId="1943174950">
+    <w:abstractNumId w:val="8"/>
+  </w:num>
+  <w:num w:numId="7" w16cid:durableId="1125848734">
     <w:abstractNumId w:val="6"/>
   </w:num>
-  <w:num w:numId="3" w16cid:durableId="1626958236">
-    <w:abstractNumId w:val="8"/>
-  </w:num>
-  <w:num w:numId="4" w16cid:durableId="1941402265">
+  <w:num w:numId="8" w16cid:durableId="2045518995">
     <w:abstractNumId w:val="4"/>
-  </w:num>
-  <w:num w:numId="5" w16cid:durableId="456412381">
-    <w:abstractNumId w:val="2"/>
-  </w:num>
-  <w:num w:numId="6" w16cid:durableId="1943174950">
-    <w:abstractNumId w:val="7"/>
-  </w:num>
-  <w:num w:numId="7" w16cid:durableId="1125848734">
-    <w:abstractNumId w:val="5"/>
-  </w:num>
-  <w:num w:numId="8" w16cid:durableId="2045518995">
-    <w:abstractNumId w:val="3"/>
   </w:num>
   <w:num w:numId="9" w16cid:durableId="398138303">
     <w:abstractNumId w:val="0"/>
+  </w:num>
+  <w:num w:numId="10" w16cid:durableId="1125008329">
+    <w:abstractNumId w:val="1"/>
   </w:num>
 </w:numbering>
 </file>

</xml_diff>

<commit_message>
fixed a token persistence bug for the Design Patterns account,  redesigned the Profile tab with a circular photo, centered name, and Personal Info section
</commit_message>
<xml_diff>
--- a/Project1/B26 Ex01 LotemKimchi 318173481 ShaniSalomon 208573683/Design Patterns Assignment.docx
+++ b/Project1/B26 Ex01 LotemKimchi 318173481 ShaniSalomon 208573683/Design Patterns Assignment.docx
@@ -166,11 +166,9 @@
         </w:rPr>
         <w:t xml:space="preserve"> </w:t>
       </w:r>
-      <w:proofErr w:type="spellStart"/>
       <w:r>
         <w:t>photo.Comments.Count</w:t>
       </w:r>
-      <w:proofErr w:type="spellEnd"/>
     </w:p>
     <w:p>
       <w:pPr>
@@ -340,11 +338,9 @@
               <w:spacing w:after="160" w:line="278" w:lineRule="auto"/>
               <w:jc w:val="right"/>
             </w:pPr>
-            <w:proofErr w:type="spellStart"/>
             <w:r>
               <w:t>MostCommentedPhotoFeature.cs</w:t>
             </w:r>
-            <w:proofErr w:type="spellEnd"/>
           </w:p>
         </w:tc>
         <w:tc>
@@ -379,13 +375,8 @@
               <w:spacing w:after="160" w:line="278" w:lineRule="auto"/>
               <w:jc w:val="right"/>
             </w:pPr>
-            <w:proofErr w:type="spellStart"/>
             <w:r>
-              <w:t>FormMain.cs</w:t>
-            </w:r>
-            <w:proofErr w:type="spellEnd"/>
-            <w:r>
-              <w:t xml:space="preserve"> – buttonMostCommentedPhoto_Click_1()</w:t>
+              <w:t>FormMain.cs – buttonMostCommentedPhoto_Click_1()</w:t>
             </w:r>
           </w:p>
         </w:tc>
@@ -438,21 +429,7 @@
         <w:rPr>
           <w:rtl/>
         </w:rPr>
-        <w:t xml:space="preserve">פיצ'ר זה מאתר את התמונה בעלת מספר </w:t>
-      </w:r>
-      <w:proofErr w:type="spellStart"/>
-      <w:r>
-        <w:rPr>
-          <w:rtl/>
-        </w:rPr>
-        <w:t>הלייקים</w:t>
-      </w:r>
-      <w:proofErr w:type="spellEnd"/>
-      <w:r>
-        <w:rPr>
-          <w:rtl/>
-        </w:rPr>
-        <w:t xml:space="preserve"> הגבוה ביותר</w:t>
+        <w:t>פיצ'ר זה מאתר את התמונה בעלת מספר הלייקים הגבוה ביותר</w:t>
       </w:r>
       <w:r>
         <w:t>.</w:t>
@@ -483,16 +460,8 @@
         <w:rPr>
           <w:rtl/>
         </w:rPr>
-        <w:t xml:space="preserve">הפיצ'ר עובר על כל האלבומים והתמונות ובודק עבור כל תמונה את מספר </w:t>
-      </w:r>
-      <w:proofErr w:type="spellStart"/>
-      <w:r>
-        <w:rPr>
-          <w:rtl/>
-        </w:rPr>
-        <w:t>הלייקים</w:t>
-      </w:r>
-      <w:proofErr w:type="spellEnd"/>
+        <w:t>הפיצ'ר עובר על כל האלבומים והתמונות ובודק עבור כל תמונה את מספר הלייקים</w:t>
+      </w:r>
       <w:r>
         <w:t>:</w:t>
       </w:r>
@@ -503,35 +472,19 @@
         </w:rPr>
         <w:t xml:space="preserve"> </w:t>
       </w:r>
-      <w:proofErr w:type="spellStart"/>
       <w:r>
         <w:t>photo.LikedBy.Count</w:t>
       </w:r>
-      <w:proofErr w:type="spellEnd"/>
-    </w:p>
-    <w:p>
-      <w:pPr>
-        <w:bidi/>
-      </w:pPr>
-      <w:r>
-        <w:rPr>
-          <w:rtl/>
-        </w:rPr>
-        <w:t xml:space="preserve">התמונה עם מספר </w:t>
-      </w:r>
-      <w:proofErr w:type="spellStart"/>
-      <w:r>
-        <w:rPr>
-          <w:rtl/>
-        </w:rPr>
-        <w:t>הלייקים</w:t>
-      </w:r>
-      <w:proofErr w:type="spellEnd"/>
-      <w:r>
-        <w:rPr>
-          <w:rtl/>
-        </w:rPr>
-        <w:t xml:space="preserve"> הגבוה ביותר נשמרת ומוחזרת</w:t>
+    </w:p>
+    <w:p>
+      <w:pPr>
+        <w:bidi/>
+      </w:pPr>
+      <w:r>
+        <w:rPr>
+          <w:rtl/>
+        </w:rPr>
+        <w:t>התמונה עם מספר הלייקים הגבוה ביותר נשמרת ומוחזרת</w:t>
       </w:r>
       <w:r>
         <w:t>.</w:t>
@@ -702,11 +655,9 @@
               <w:spacing w:after="160" w:line="278" w:lineRule="auto"/>
               <w:jc w:val="right"/>
             </w:pPr>
-            <w:proofErr w:type="spellStart"/>
             <w:r>
               <w:t>MostLikedPhotoFeature.cs</w:t>
             </w:r>
-            <w:proofErr w:type="spellEnd"/>
           </w:p>
         </w:tc>
         <w:tc>
@@ -741,13 +692,8 @@
               <w:spacing w:after="160" w:line="278" w:lineRule="auto"/>
               <w:jc w:val="right"/>
             </w:pPr>
-            <w:proofErr w:type="spellStart"/>
             <w:r>
-              <w:t>FormMain.cs</w:t>
-            </w:r>
-            <w:proofErr w:type="spellEnd"/>
-            <w:r>
-              <w:t xml:space="preserve"> – buttonMostLikedPhoto_Click_1()</w:t>
+              <w:t>FormMain.cs – buttonMostLikedPhoto_Click_1()</w:t>
             </w:r>
           </w:p>
         </w:tc>
@@ -841,13 +787,9 @@
       <w:pPr>
         <w:bidi/>
       </w:pPr>
-      <w:proofErr w:type="spellStart"/>
-      <w:proofErr w:type="gramStart"/>
       <w:r>
         <w:t>photo.CreatedTime</w:t>
       </w:r>
-      <w:proofErr w:type="spellEnd"/>
-      <w:proofErr w:type="gramEnd"/>
     </w:p>
     <w:p>
       <w:pPr>
@@ -1026,11 +968,9 @@
               <w:spacing w:after="160" w:line="278" w:lineRule="auto"/>
               <w:jc w:val="right"/>
             </w:pPr>
-            <w:proofErr w:type="spellStart"/>
             <w:r>
               <w:t>OldestPhotoFeature.cs</w:t>
             </w:r>
-            <w:proofErr w:type="spellEnd"/>
           </w:p>
         </w:tc>
         <w:tc>
@@ -1065,13 +1005,8 @@
               <w:spacing w:after="160" w:line="278" w:lineRule="auto"/>
               <w:jc w:val="right"/>
             </w:pPr>
-            <w:proofErr w:type="spellStart"/>
             <w:r>
-              <w:t>FormMain.cs</w:t>
-            </w:r>
-            <w:proofErr w:type="spellEnd"/>
-            <w:r>
-              <w:t xml:space="preserve"> – buttonOldestPhoto_Click_1()</w:t>
+              <w:t>FormMain.cs – buttonOldestPhoto_Click_1()</w:t>
             </w:r>
           </w:p>
         </w:tc>
@@ -1171,11 +1106,9 @@
         </w:rPr>
         <w:t xml:space="preserve"> </w:t>
       </w:r>
-      <w:proofErr w:type="spellStart"/>
       <w:r>
         <w:t>album.Photos.Count</w:t>
       </w:r>
-      <w:proofErr w:type="spellEnd"/>
     </w:p>
     <w:p>
       <w:pPr>
@@ -1338,11 +1271,9 @@
               <w:spacing w:after="160" w:line="278" w:lineRule="auto"/>
               <w:jc w:val="right"/>
             </w:pPr>
-            <w:proofErr w:type="spellStart"/>
             <w:r>
               <w:t>AlbumWithMostPhotosFeature.cs</w:t>
             </w:r>
-            <w:proofErr w:type="spellEnd"/>
           </w:p>
         </w:tc>
         <w:tc>
@@ -1376,29 +1307,8 @@
               <w:spacing w:after="160" w:line="278" w:lineRule="auto"/>
               <w:jc w:val="right"/>
             </w:pPr>
-            <w:proofErr w:type="spellStart"/>
             <w:r>
-              <w:t>FormMain.cs</w:t>
-            </w:r>
-            <w:proofErr w:type="spellEnd"/>
-            <w:r>
-              <w:t xml:space="preserve"> – </w:t>
-            </w:r>
-            <w:proofErr w:type="spellStart"/>
-            <w:r>
-              <w:t>buttonMostPhotosAlbum_</w:t>
-            </w:r>
-            <w:proofErr w:type="gramStart"/>
-            <w:r>
-              <w:t>Click</w:t>
-            </w:r>
-            <w:proofErr w:type="spellEnd"/>
-            <w:r>
-              <w:t>(</w:t>
-            </w:r>
-            <w:proofErr w:type="gramEnd"/>
-            <w:r>
-              <w:t>)</w:t>
+              <w:t>FormMain.cs – buttonMostPhotosAlbum_Click()</w:t>
             </w:r>
           </w:p>
         </w:tc>
@@ -1571,7 +1481,6 @@
         </w:rPr>
         <w:t xml:space="preserve"> (</w:t>
       </w:r>
-      <w:proofErr w:type="gramStart"/>
       <w:r>
         <w:t xml:space="preserve">N </w:t>
       </w:r>
@@ -1589,7 +1498,6 @@
         </w:rPr>
         <w:t>=</w:t>
       </w:r>
-      <w:proofErr w:type="gramEnd"/>
       <w:r>
         <w:rPr>
           <w:rtl/>
@@ -1698,11 +1606,9 @@
               <w:spacing w:after="160" w:line="278" w:lineRule="auto"/>
               <w:jc w:val="right"/>
             </w:pPr>
-            <w:proofErr w:type="spellStart"/>
             <w:r>
               <w:t>CountAlbumsFeature.cs</w:t>
             </w:r>
-            <w:proofErr w:type="spellEnd"/>
           </w:p>
         </w:tc>
         <w:tc>
@@ -1737,29 +1643,8 @@
               <w:spacing w:after="160" w:line="278" w:lineRule="auto"/>
               <w:jc w:val="right"/>
             </w:pPr>
-            <w:proofErr w:type="spellStart"/>
             <w:r>
-              <w:t>FormMain.cs</w:t>
-            </w:r>
-            <w:proofErr w:type="spellEnd"/>
-            <w:r>
-              <w:t xml:space="preserve"> – </w:t>
-            </w:r>
-            <w:proofErr w:type="spellStart"/>
-            <w:r>
-              <w:t>buttonCountAlbums_</w:t>
-            </w:r>
-            <w:proofErr w:type="gramStart"/>
-            <w:r>
-              <w:t>Click</w:t>
-            </w:r>
-            <w:proofErr w:type="spellEnd"/>
-            <w:r>
-              <w:t>(</w:t>
-            </w:r>
-            <w:proofErr w:type="gramEnd"/>
-            <w:r>
-              <w:t>)</w:t>
+              <w:t>FormMain.cs – buttonCountAlbums_Click()</w:t>
             </w:r>
           </w:p>
         </w:tc>
@@ -1821,7 +1706,6 @@
         </w:rPr>
         <w:t xml:space="preserve">המחלקה </w:t>
       </w:r>
-      <w:proofErr w:type="spellStart"/>
       <w:r>
         <w:rPr>
           <w:b/>
@@ -1829,7 +1713,6 @@
         </w:rPr>
         <w:t>FacebookManager</w:t>
       </w:r>
-      <w:proofErr w:type="spellEnd"/>
       <w:r>
         <w:t xml:space="preserve"> </w:t>
       </w:r>
@@ -1937,15 +1820,7 @@
     <w:p>
       <w:r>
         <w:lastRenderedPageBreak/>
-        <w:t xml:space="preserve">public interface </w:t>
-      </w:r>
-      <w:proofErr w:type="spellStart"/>
-      <w:r>
-        <w:t>IFacebookFeature</w:t>
-      </w:r>
-      <w:proofErr w:type="spellEnd"/>
-      <w:r>
-        <w:t>&lt;T&gt;</w:t>
+        <w:t>public interface IFacebookFeature&lt;T&gt;</w:t>
       </w:r>
     </w:p>
     <w:p>
@@ -2042,15 +1917,7 @@
         <w:t>ב</w:t>
       </w:r>
       <w:r>
-        <w:t>-</w:t>
-      </w:r>
-      <w:proofErr w:type="spellStart"/>
-      <w:r>
-        <w:t>FormMain</w:t>
-      </w:r>
-      <w:proofErr w:type="spellEnd"/>
-      <w:r>
-        <w:t xml:space="preserve"> </w:t>
+        <w:t xml:space="preserve">-FormMain </w:t>
       </w:r>
       <w:r>
         <w:rPr>
@@ -2063,54 +1930,13 @@
       </w:r>
     </w:p>
     <w:p>
-      <w:proofErr w:type="spellStart"/>
-      <w:r>
-        <w:t>IFacebookFeature</w:t>
-      </w:r>
-      <w:proofErr w:type="spellEnd"/>
-      <w:r>
-        <w:t xml:space="preserve">&lt;Photo&gt; feature = new </w:t>
-      </w:r>
-      <w:proofErr w:type="spellStart"/>
-      <w:proofErr w:type="gramStart"/>
-      <w:r>
-        <w:t>MostCommentedPhotoFeature</w:t>
-      </w:r>
-      <w:proofErr w:type="spellEnd"/>
-      <w:r>
-        <w:t>(</w:t>
-      </w:r>
-      <w:proofErr w:type="gramEnd"/>
-      <w:r>
-        <w:t>);</w:t>
+      <w:r>
+        <w:t>IFacebookFeature&lt;Photo&gt; feature = new MostCommentedPhotoFeature();</w:t>
       </w:r>
       <w:r>
         <w:br/>
-        <w:t xml:space="preserve">Photo </w:t>
-      </w:r>
-      <w:proofErr w:type="spellStart"/>
-      <w:r>
-        <w:t>photo</w:t>
-      </w:r>
-      <w:proofErr w:type="spellEnd"/>
-      <w:r>
-        <w:t xml:space="preserve"> = </w:t>
-      </w:r>
-      <w:proofErr w:type="spellStart"/>
-      <w:proofErr w:type="gramStart"/>
-      <w:r>
-        <w:t>feature.Execute</w:t>
-      </w:r>
-      <w:proofErr w:type="spellEnd"/>
-      <w:proofErr w:type="gramEnd"/>
-      <w:r>
-        <w:t>(user</w:t>
-      </w:r>
-      <w:proofErr w:type="gramStart"/>
-      <w:r>
-        <w:t>);</w:t>
-      </w:r>
-      <w:proofErr w:type="gramEnd"/>
+        <w:t>Photo photo = feature.Execute(user);</w:t>
+      </w:r>
     </w:p>
     <w:p>
       <w:pPr>
@@ -2122,13 +1948,8 @@
         </w:rPr>
         <w:t xml:space="preserve">כך המחלקה </w:t>
       </w:r>
-      <w:proofErr w:type="spellStart"/>
-      <w:r>
-        <w:t>FormMain</w:t>
-      </w:r>
-      <w:proofErr w:type="spellEnd"/>
-      <w:r>
-        <w:t xml:space="preserve"> </w:t>
+      <w:r>
+        <w:t xml:space="preserve">FormMain </w:t>
       </w:r>
       <w:r>
         <w:rPr>
@@ -2185,16 +2006,11 @@
         <w:br/>
       </w:r>
       <w:r>
-        <w:rPr>
-          <w:rFonts w:ascii="Segoe UI Emoji" w:hAnsi="Segoe UI Emoji" w:cs="Times New Roman"/>
-          <w:noProof/>
-          <w:rtl/>
-        </w:rPr>
         <w:drawing>
-          <wp:inline distT="0" distB="0" distL="0" distR="0" wp14:anchorId="1C38797C" wp14:editId="1752ABD1">
-            <wp:extent cx="3006969" cy="2125438"/>
-            <wp:effectExtent l="0" t="0" r="3175" b="8255"/>
-            <wp:docPr id="1315243902" name="Picture 1"/>
+          <wp:inline distT="0" distB="0" distL="0" distR="0" wp14:anchorId="5250E5F4" wp14:editId="0D26E4BD">
+            <wp:extent cx="5943600" cy="4688205"/>
+            <wp:effectExtent l="0" t="0" r="0" b="0"/>
+            <wp:docPr id="784615062" name="Picture 1"/>
             <wp:cNvGraphicFramePr>
               <a:graphicFrameLocks xmlns:a="http://schemas.openxmlformats.org/drawingml/2006/main" noChangeAspect="1"/>
             </wp:cNvGraphicFramePr>
@@ -2202,7 +2018,7 @@
               <a:graphicData uri="http://schemas.openxmlformats.org/drawingml/2006/picture">
                 <pic:pic xmlns:pic="http://schemas.openxmlformats.org/drawingml/2006/picture">
                   <pic:nvPicPr>
-                    <pic:cNvPr id="1315243902" name=""/>
+                    <pic:cNvPr id="784615062" name=""/>
                     <pic:cNvPicPr/>
                   </pic:nvPicPr>
                   <pic:blipFill>
@@ -2214,7 +2030,7 @@
                   <pic:spPr>
                     <a:xfrm>
                       <a:off x="0" y="0"/>
-                      <a:ext cx="3020887" cy="2135276"/>
+                      <a:ext cx="5943600" cy="4688205"/>
                     </a:xfrm>
                     <a:prstGeom prst="rect">
                       <a:avLst/>
@@ -2229,21 +2045,18 @@
     </w:p>
     <w:p>
       <w:r>
+        <w:lastRenderedPageBreak/>
         <w:t>Screen after login – Profile tab</w:t>
       </w:r>
       <w:r>
         <w:br/>
       </w:r>
       <w:r>
-        <w:rPr>
-          <w:rFonts w:cs="Arial"/>
-          <w:rtl/>
-        </w:rPr>
         <w:drawing>
-          <wp:inline distT="0" distB="0" distL="0" distR="0" wp14:anchorId="17675F3D" wp14:editId="45F9C494">
-            <wp:extent cx="3686908" cy="2618650"/>
-            <wp:effectExtent l="0" t="0" r="0" b="0"/>
-            <wp:docPr id="750566175" name="Picture 1"/>
+          <wp:inline distT="0" distB="0" distL="0" distR="0" wp14:anchorId="73258E08" wp14:editId="76558885">
+            <wp:extent cx="5943600" cy="4699635"/>
+            <wp:effectExtent l="0" t="0" r="0" b="5715"/>
+            <wp:docPr id="1799796127" name="Picture 1"/>
             <wp:cNvGraphicFramePr>
               <a:graphicFrameLocks xmlns:a="http://schemas.openxmlformats.org/drawingml/2006/main" noChangeAspect="1"/>
             </wp:cNvGraphicFramePr>
@@ -2251,7 +2064,7 @@
               <a:graphicData uri="http://schemas.openxmlformats.org/drawingml/2006/picture">
                 <pic:pic xmlns:pic="http://schemas.openxmlformats.org/drawingml/2006/picture">
                   <pic:nvPicPr>
-                    <pic:cNvPr id="750566175" name=""/>
+                    <pic:cNvPr id="1799796127" name=""/>
                     <pic:cNvPicPr/>
                   </pic:nvPicPr>
                   <pic:blipFill>
@@ -2263,7 +2076,7 @@
                   <pic:spPr>
                     <a:xfrm>
                       <a:off x="0" y="0"/>
-                      <a:ext cx="3702301" cy="2629583"/>
+                      <a:ext cx="5943600" cy="4699635"/>
                     </a:xfrm>
                     <a:prstGeom prst="rect">
                       <a:avLst/>
@@ -2286,21 +2099,23 @@
     </w:p>
     <w:p>
       <w:r>
-        <w:t>Album &amp; photos tab</w:t>
-      </w:r>
-    </w:p>
-    <w:p>
-      <w:r>
-        <w:rPr>
-          <w:rFonts w:cs="Arial"/>
-          <w:rtl/>
-        </w:rPr>
+        <w:t xml:space="preserve">Album </w:t>
+      </w:r>
+      <w:r>
+        <w:t xml:space="preserve">Analyst </w:t>
+      </w:r>
+      <w:r>
+        <w:t>tab</w:t>
+      </w:r>
+    </w:p>
+    <w:p>
+      <w:r>
         <w:lastRenderedPageBreak/>
         <w:drawing>
-          <wp:inline distT="0" distB="0" distL="0" distR="0" wp14:anchorId="43B71F8A" wp14:editId="259E6E72">
-            <wp:extent cx="4056991" cy="2889738"/>
-            <wp:effectExtent l="0" t="0" r="1270" b="6350"/>
-            <wp:docPr id="19718121" name="Picture 1"/>
+          <wp:inline distT="0" distB="0" distL="0" distR="0" wp14:anchorId="1C7A7E99" wp14:editId="0567D1ED">
+            <wp:extent cx="5943600" cy="4725670"/>
+            <wp:effectExtent l="0" t="0" r="0" b="0"/>
+            <wp:docPr id="923816176" name="Picture 1"/>
             <wp:cNvGraphicFramePr>
               <a:graphicFrameLocks xmlns:a="http://schemas.openxmlformats.org/drawingml/2006/main" noChangeAspect="1"/>
             </wp:cNvGraphicFramePr>
@@ -2308,7 +2123,7 @@
               <a:graphicData uri="http://schemas.openxmlformats.org/drawingml/2006/picture">
                 <pic:pic xmlns:pic="http://schemas.openxmlformats.org/drawingml/2006/picture">
                   <pic:nvPicPr>
-                    <pic:cNvPr id="19718121" name=""/>
+                    <pic:cNvPr id="923816176" name=""/>
                     <pic:cNvPicPr/>
                   </pic:nvPicPr>
                   <pic:blipFill>
@@ -2320,7 +2135,7 @@
                   <pic:spPr>
                     <a:xfrm>
                       <a:off x="0" y="0"/>
-                      <a:ext cx="4078181" cy="2904831"/>
+                      <a:ext cx="5943600" cy="4725670"/>
                     </a:xfrm>
                     <a:prstGeom prst="rect">
                       <a:avLst/>
@@ -2334,32 +2149,19 @@
       </w:r>
     </w:p>
     <w:p>
-      <w:pPr>
-        <w:rPr>
-          <w:rtl/>
-        </w:rPr>
-      </w:pPr>
-      <w:r>
-        <w:t xml:space="preserve">After </w:t>
-      </w:r>
-      <w:r>
-        <w:t xml:space="preserve">clicking </w:t>
-      </w:r>
-      <w:r>
-        <w:t>Oldest Photo and Album with most photos</w:t>
-      </w:r>
-    </w:p>
-    <w:p>
-      <w:r>
-        <w:rPr>
-          <w:rFonts w:cs="Arial"/>
-          <w:rtl/>
-        </w:rPr>
+      <w:r>
+        <w:lastRenderedPageBreak/>
+        <w:t>Album Analyst tab</w:t>
+      </w:r>
+      <w:r>
+        <w:t xml:space="preserve"> after clicking on all the buttons </w:t>
+      </w:r>
+      <w:r>
         <w:drawing>
-          <wp:inline distT="0" distB="0" distL="0" distR="0" wp14:anchorId="13A8BC5A" wp14:editId="69E62896">
-            <wp:extent cx="4337538" cy="3082619"/>
-            <wp:effectExtent l="0" t="0" r="6350" b="3810"/>
-            <wp:docPr id="260052224" name="Picture 1"/>
+          <wp:inline distT="0" distB="0" distL="0" distR="0" wp14:anchorId="6B76976E" wp14:editId="3101E39A">
+            <wp:extent cx="5943600" cy="4695825"/>
+            <wp:effectExtent l="0" t="0" r="0" b="9525"/>
+            <wp:docPr id="95986851" name="Picture 1"/>
             <wp:cNvGraphicFramePr>
               <a:graphicFrameLocks xmlns:a="http://schemas.openxmlformats.org/drawingml/2006/main" noChangeAspect="1"/>
             </wp:cNvGraphicFramePr>
@@ -2367,7 +2169,7 @@
               <a:graphicData uri="http://schemas.openxmlformats.org/drawingml/2006/picture">
                 <pic:pic xmlns:pic="http://schemas.openxmlformats.org/drawingml/2006/picture">
                   <pic:nvPicPr>
-                    <pic:cNvPr id="260052224" name=""/>
+                    <pic:cNvPr id="95986851" name=""/>
                     <pic:cNvPicPr/>
                   </pic:nvPicPr>
                   <pic:blipFill>
@@ -2379,7 +2181,7 @@
                   <pic:spPr>
                     <a:xfrm>
                       <a:off x="0" y="0"/>
-                      <a:ext cx="4342034" cy="3085814"/>
+                      <a:ext cx="5943600" cy="4695825"/>
                     </a:xfrm>
                     <a:prstGeom prst="rect">
                       <a:avLst/>
@@ -2399,21 +2201,15 @@
     </w:p>
     <w:p>
       <w:r>
-        <w:t>Analytics</w:t>
-      </w:r>
-    </w:p>
-    <w:p>
-      <w:r>
-        <w:rPr>
-          <w:rFonts w:cs="Arial"/>
-          <w:rtl/>
-        </w:rPr>
         <w:lastRenderedPageBreak/>
+        <w:t>Photos Analyst tab</w:t>
+      </w:r>
+      <w:r>
         <w:drawing>
-          <wp:inline distT="0" distB="0" distL="0" distR="0" wp14:anchorId="40F02FB3" wp14:editId="4B951C91">
-            <wp:extent cx="4861785" cy="3458308"/>
-            <wp:effectExtent l="0" t="0" r="0" b="8890"/>
-            <wp:docPr id="1847843270" name="Picture 1"/>
+          <wp:inline distT="0" distB="0" distL="0" distR="0" wp14:anchorId="5454BE05" wp14:editId="74B427B0">
+            <wp:extent cx="5943600" cy="4700905"/>
+            <wp:effectExtent l="0" t="0" r="0" b="4445"/>
+            <wp:docPr id="327832629" name="Picture 1"/>
             <wp:cNvGraphicFramePr>
               <a:graphicFrameLocks xmlns:a="http://schemas.openxmlformats.org/drawingml/2006/main" noChangeAspect="1"/>
             </wp:cNvGraphicFramePr>
@@ -2421,7 +2217,7 @@
               <a:graphicData uri="http://schemas.openxmlformats.org/drawingml/2006/picture">
                 <pic:pic xmlns:pic="http://schemas.openxmlformats.org/drawingml/2006/picture">
                   <pic:nvPicPr>
-                    <pic:cNvPr id="1847843270" name=""/>
+                    <pic:cNvPr id="327832629" name=""/>
                     <pic:cNvPicPr/>
                   </pic:nvPicPr>
                   <pic:blipFill>
@@ -2433,7 +2229,7 @@
                   <pic:spPr>
                     <a:xfrm>
                       <a:off x="0" y="0"/>
-                      <a:ext cx="4866699" cy="3461804"/>
+                      <a:ext cx="5943600" cy="4700905"/>
                     </a:xfrm>
                     <a:prstGeom prst="rect">
                       <a:avLst/>
@@ -2453,18 +2249,31 @@
         </w:rPr>
       </w:pPr>
       <w:r>
-        <w:t>After clicking on the button in Analytics tab</w:t>
+        <w:lastRenderedPageBreak/>
+        <w:t>Photos Analyst tab</w:t>
+      </w:r>
+      <w:r>
+        <w:t xml:space="preserve"> </w:t>
+      </w:r>
+      <w:r>
+        <w:t>after clicking on all the buttons</w:t>
       </w:r>
       <w:r>
         <w:rPr>
           <w:rFonts w:cs="Arial"/>
           <w:rtl/>
         </w:rPr>
+        <w:t xml:space="preserve"> </w:t>
+      </w:r>
+      <w:r>
+        <w:rPr>
+          <w:rFonts w:cs="Arial"/>
+        </w:rPr>
         <w:drawing>
-          <wp:inline distT="0" distB="0" distL="0" distR="0" wp14:anchorId="24BBC6E1" wp14:editId="522DBB06">
-            <wp:extent cx="4351370" cy="3053862"/>
-            <wp:effectExtent l="0" t="0" r="0" b="0"/>
-            <wp:docPr id="1342637364" name="Picture 1"/>
+          <wp:inline distT="0" distB="0" distL="0" distR="0" wp14:anchorId="077E72CF" wp14:editId="19071604">
+            <wp:extent cx="5943600" cy="4699000"/>
+            <wp:effectExtent l="0" t="0" r="0" b="6350"/>
+            <wp:docPr id="437487484" name="Picture 1"/>
             <wp:cNvGraphicFramePr>
               <a:graphicFrameLocks xmlns:a="http://schemas.openxmlformats.org/drawingml/2006/main" noChangeAspect="1"/>
             </wp:cNvGraphicFramePr>
@@ -2472,7 +2281,7 @@
               <a:graphicData uri="http://schemas.openxmlformats.org/drawingml/2006/picture">
                 <pic:pic xmlns:pic="http://schemas.openxmlformats.org/drawingml/2006/picture">
                   <pic:nvPicPr>
-                    <pic:cNvPr id="1342637364" name=""/>
+                    <pic:cNvPr id="437487484" name=""/>
                     <pic:cNvPicPr/>
                   </pic:nvPicPr>
                   <pic:blipFill>
@@ -2484,7 +2293,7 @@
                   <pic:spPr>
                     <a:xfrm>
                       <a:off x="0" y="0"/>
-                      <a:ext cx="4357027" cy="3057832"/>
+                      <a:ext cx="5943600" cy="4699000"/>
                     </a:xfrm>
                     <a:prstGeom prst="rect">
                       <a:avLst/>
@@ -2498,6 +2307,12 @@
       </w:r>
       <w:r>
         <w:rPr>
+          <w:rFonts w:cs="Arial"/>
+        </w:rPr>
+        <w:t xml:space="preserve"> </w:t>
+      </w:r>
+      <w:r>
+        <w:rPr>
           <w:rtl/>
         </w:rPr>
         <w:br w:type="page"/>
@@ -2529,6 +2344,7 @@
         <w:rPr>
           <w:b/>
           <w:bCs/>
+          <w:rtl/>
         </w:rPr>
       </w:pPr>
       <w:r>
@@ -2541,7 +2357,6 @@
     </w:p>
     <w:p>
       <w:pPr>
-        <w:bidi/>
         <w:rPr>
           <w:rtl/>
         </w:rPr>
@@ -2553,14 +2368,17 @@
         <w:t xml:space="preserve"> </w:t>
       </w:r>
       <w:r>
+        <w:t xml:space="preserve"> </w:t>
+      </w:r>
+      <w:r>
         <w:rPr>
           <w:noProof/>
         </w:rPr>
         <w:drawing>
-          <wp:inline distT="0" distB="0" distL="0" distR="0" wp14:anchorId="03C36F35" wp14:editId="306B3BBC">
-            <wp:extent cx="2914758" cy="5098564"/>
-            <wp:effectExtent l="0" t="0" r="0" b="6985"/>
-            <wp:docPr id="1399378797" name="Picture 5"/>
+          <wp:inline distT="0" distB="0" distL="0" distR="0" wp14:anchorId="08926BD2" wp14:editId="1A47C5E6">
+            <wp:extent cx="2972095" cy="5571067"/>
+            <wp:effectExtent l="0" t="0" r="0" b="0"/>
+            <wp:docPr id="1869277546" name="Picture 2"/>
             <wp:cNvGraphicFramePr>
               <a:graphicFrameLocks xmlns:a="http://schemas.openxmlformats.org/drawingml/2006/main" noChangeAspect="1"/>
             </wp:cNvGraphicFramePr>
@@ -2568,7 +2386,7 @@
               <a:graphicData uri="http://schemas.openxmlformats.org/drawingml/2006/picture">
                 <pic:pic xmlns:pic="http://schemas.openxmlformats.org/drawingml/2006/picture">
                   <pic:nvPicPr>
-                    <pic:cNvPr id="0" name="Picture 9"/>
+                    <pic:cNvPr id="0" name="Picture 3"/>
                     <pic:cNvPicPr>
                       <a:picLocks noChangeAspect="1" noChangeArrowheads="1"/>
                     </pic:cNvPicPr>
@@ -2589,7 +2407,7 @@
                   <pic:spPr bwMode="auto">
                     <a:xfrm>
                       <a:off x="0" y="0"/>
-                      <a:ext cx="2937476" cy="5138303"/>
+                      <a:ext cx="2973878" cy="5574408"/>
                     </a:xfrm>
                     <a:prstGeom prst="rect">
                       <a:avLst/>
@@ -2644,31 +2462,15 @@
     </w:p>
     <w:p>
       <w:pPr>
-        <w:rPr>
-          <w:b/>
-          <w:bCs/>
-        </w:rPr>
-      </w:pPr>
-      <w:r>
-        <w:rPr>
-          <w:b/>
-          <w:bCs/>
-        </w:rPr>
-        <w:br w:type="page"/>
-      </w:r>
-    </w:p>
-    <w:p>
-      <w:pPr>
         <w:bidi/>
       </w:pPr>
       <w:r>
         <w:rPr>
           <w:noProof/>
         </w:rPr>
-        <w:lastRenderedPageBreak/>
         <w:drawing>
-          <wp:inline distT="0" distB="0" distL="0" distR="0" wp14:anchorId="28957F2B" wp14:editId="482AF6A4">
-            <wp:extent cx="5943600" cy="3754120"/>
+          <wp:inline distT="0" distB="0" distL="0" distR="0" wp14:anchorId="28957F2B" wp14:editId="6A8B5156">
+            <wp:extent cx="5528733" cy="3492080"/>
             <wp:effectExtent l="0" t="0" r="0" b="0"/>
             <wp:docPr id="514752184" name="Picture 1"/>
             <wp:cNvGraphicFramePr>
@@ -2699,7 +2501,7 @@
                   <pic:spPr bwMode="auto">
                     <a:xfrm>
                       <a:off x="0" y="0"/>
-                      <a:ext cx="5943600" cy="3754120"/>
+                      <a:ext cx="5532992" cy="3494770"/>
                     </a:xfrm>
                     <a:prstGeom prst="rect">
                       <a:avLst/>
@@ -4707,6 +4509,7 @@
   <w:style w:type="paragraph" w:default="1" w:styleId="Normal">
     <w:name w:val="Normal"/>
     <w:qFormat/>
+    <w:rsid w:val="00312207"/>
   </w:style>
   <w:style w:type="paragraph" w:styleId="Heading1">
     <w:name w:val="heading 1"/>

</xml_diff>